<commit_message>
Forbidden Offspring: dual byline 'Lothar J. Musiol writing as Frank Stone'
Title and copyright page, pen-name note, About the Author (Version B) and canonical Also-by page added to the build; EPUB/docx metadata names only (Lothar primary, Frank Stone contributor), as for Lolly Wren. Pen-name rule recorded in LOTHAR_RULES, ALSO_BY and ABOUT_THE_AUTHOR canonical notes.

Co-Authored-By: Claude Sonnet 5.5 <noreply@anthropic.com>
</commit_message>
<xml_diff>
--- a/Forbidden_Offspring/Forbidden_Offspring_v1.docx
+++ b/Forbidden_Offspring/Forbidden_Offspring_v1.docx
@@ -15,26 +15,24 @@
     </w:p>
     <w:p>
       <w:pPr>
+        <w:pStyle w:val="Subtitle"/>
+      </w:pPr>
+      <w:r>
+        <w:rPr>
+          <w:lang w:val="en-US"/>
+        </w:rPr>
+        <w:t xml:space="preserve">A Novel</w:t>
+      </w:r>
+    </w:p>
+    <w:p>
+      <w:pPr>
         <w:pStyle w:val="Author"/>
       </w:pPr>
       <w:r>
         <w:rPr>
           <w:lang w:val="en-US"/>
         </w:rPr>
-        <w:t xml:space="preserve">Frank Stone</w:t>
-      </w:r>
-    </w:p>
-    <w:bookmarkStart w:id="9" w:name="forbidden-offspring"/>
-    <w:p>
-      <w:pPr>
-        <w:pStyle w:val="Heading1"/>
-        <w:pageBreakBefore/>
-      </w:pPr>
-      <w:r>
-        <w:rPr>
-          <w:lang w:val="en-US"/>
-        </w:rPr>
-        <w:t xml:space="preserve">Forbidden Offspring</w:t>
+        <w:t xml:space="preserve">Lothar J. Musiol writing as Frank Stone</w:t>
       </w:r>
     </w:p>
     <w:p>
@@ -43,11 +41,20 @@
       </w:pPr>
       <w:r>
         <w:rPr>
-          <w:i/>
-          <w:iCs/>
-          <w:lang w:val="en-US"/>
-        </w:rPr>
-        <w:t xml:space="preserve">A novel</w:t>
+          <w:lang w:val="en-US"/>
+        </w:rPr>
+        <w:t xml:space="preserve">Copyright © 2026 Lothar J. Musiol. All rights reserved. No part of this publication may be reproduced, distributed, or transmitted in any form or by any means, including photocopying, recording, or other electronic or mechanical methods, without the prior written permission of the author, except in the case of brief quotations embodied in critical reviews and certain other non-commercial uses permitted by copyright law.</w:t>
+      </w:r>
+    </w:p>
+    <w:p>
+      <w:pPr>
+        <w:pStyle w:val="BodyText"/>
+      </w:pPr>
+      <w:r>
+        <w:rPr>
+          <w:lang w:val="en-US"/>
+        </w:rPr>
+        <w:t xml:space="preserve">This is a work of fiction. All people, clinics, universities, companies, parties and offices in the story are invented, and any resemblance to real ones is coincidence. The Appendix and the Notes and Further Reading refer to real science and real publications.</w:t>
       </w:r>
     </w:p>
     <w:p>
@@ -57,8 +64,7 @@
         </w:pict>
       </w:r>
     </w:p>
-    <w:bookmarkEnd w:id="9"/>
-    <w:bookmarkStart w:id="10" w:name="consent"/>
+    <w:bookmarkStart w:id="9" w:name="consent"/>
     <w:p>
       <w:pPr>
         <w:pStyle w:val="Heading1"/>
@@ -446,8 +452,8 @@
         <w:t xml:space="preserve">none.</w:t>
       </w:r>
     </w:p>
-    <w:bookmarkEnd w:id="10"/>
-    <w:bookmarkStart w:id="18" w:name="part-one-stone"/>
+    <w:bookmarkEnd w:id="9"/>
+    <w:bookmarkStart w:id="17" w:name="part-one-stone"/>
     <w:p>
       <w:pPr>
         <w:pStyle w:val="Heading1"/>
@@ -460,7 +466,7 @@
         <w:t xml:space="preserve">PART ONE: STONE</w:t>
       </w:r>
     </w:p>
-    <w:bookmarkStart w:id="11" w:name="four-minutes"/>
+    <w:bookmarkStart w:id="10" w:name="four-minutes"/>
     <w:p>
       <w:pPr>
         <w:pStyle w:val="Heading2"/>
@@ -1350,8 +1356,8 @@
         <w:t xml:space="preserve">I kept the handshake a good while longer than I needed to.</w:t>
       </w:r>
     </w:p>
-    <w:bookmarkEnd w:id="11"/>
-    <w:bookmarkStart w:id="12" w:name="test-time"/>
+    <w:bookmarkEnd w:id="10"/>
+    <w:bookmarkStart w:id="11" w:name="test-time"/>
     <w:p>
       <w:pPr>
         <w:pStyle w:val="Heading2"/>
@@ -2495,8 +2501,8 @@
         <w:t xml:space="preserve">I have thought since that I was wrong to call her a subject. She was a person who had noticed me. It is a rarer thing than most men think.</w:t>
       </w:r>
     </w:p>
-    <w:bookmarkEnd w:id="12"/>
-    <w:bookmarkStart w:id="13" w:name="the-ledger"/>
+    <w:bookmarkEnd w:id="11"/>
+    <w:bookmarkStart w:id="12" w:name="the-ledger"/>
     <w:p>
       <w:pPr>
         <w:pStyle w:val="Heading2"/>
@@ -3452,8 +3458,8 @@
         <w:t xml:space="preserve">I had been in that room perhaps twice. I had never listened to it.</w:t>
       </w:r>
     </w:p>
-    <w:bookmarkEnd w:id="13"/>
-    <w:bookmarkStart w:id="14" w:name="the-second-listener"/>
+    <w:bookmarkEnd w:id="12"/>
+    <w:bookmarkStart w:id="13" w:name="the-second-listener"/>
     <w:p>
       <w:pPr>
         <w:pStyle w:val="Heading2"/>
@@ -4202,8 +4208,8 @@
         <w:t xml:space="preserve">That was the first night of the account you are reading.</w:t>
       </w:r>
     </w:p>
-    <w:bookmarkEnd w:id="14"/>
-    <w:bookmarkStart w:id="15" w:name="the-apartment"/>
+    <w:bookmarkEnd w:id="13"/>
+    <w:bookmarkStart w:id="14" w:name="the-apartment"/>
     <w:p>
       <w:pPr>
         <w:pStyle w:val="Heading2"/>
@@ -5834,8 +5840,8 @@
         <w:t xml:space="preserve">I do not think he intended it as a joke.</w:t>
       </w:r>
     </w:p>
-    <w:bookmarkEnd w:id="15"/>
-    <w:bookmarkStart w:id="16" w:name="the-bargain"/>
+    <w:bookmarkEnd w:id="14"/>
+    <w:bookmarkStart w:id="15" w:name="the-bargain"/>
     <w:p>
       <w:pPr>
         <w:pStyle w:val="Heading2"/>
@@ -7238,8 +7244,8 @@
         <w:t xml:space="preserve">It was the first time I had ever thought of it as an accident.</w:t>
       </w:r>
     </w:p>
-    <w:bookmarkEnd w:id="16"/>
-    <w:bookmarkStart w:id="17" w:name="the-stroke"/>
+    <w:bookmarkEnd w:id="15"/>
+    <w:bookmarkStart w:id="16" w:name="the-stroke"/>
     <w:p>
       <w:pPr>
         <w:pStyle w:val="Heading2"/>
@@ -8156,9 +8162,9 @@
         <w:t xml:space="preserve">pen</w:t>
       </w:r>
     </w:p>
+    <w:bookmarkEnd w:id="16"/>
     <w:bookmarkEnd w:id="17"/>
-    <w:bookmarkEnd w:id="18"/>
-    <w:bookmarkStart w:id="36" w:name="part-two-the-offspring"/>
+    <w:bookmarkStart w:id="35" w:name="part-two-the-offspring"/>
     <w:p>
       <w:pPr>
         <w:pStyle w:val="Heading1"/>
@@ -8171,7 +8177,7 @@
         <w:t xml:space="preserve">PART TWO: THE OFFSPRING</w:t>
       </w:r>
     </w:p>
-    <w:bookmarkStart w:id="19" w:name="the-notebook"/>
+    <w:bookmarkStart w:id="18" w:name="the-notebook"/>
     <w:p>
       <w:pPr>
         <w:pStyle w:val="Heading2"/>
@@ -9013,8 +9019,8 @@
         <w:t xml:space="preserve">I tried, in the end, for twenty years.</w:t>
       </w:r>
     </w:p>
-    <w:bookmarkEnd w:id="19"/>
-    <w:bookmarkStart w:id="20" w:name="odd-moments"/>
+    <w:bookmarkEnd w:id="18"/>
+    <w:bookmarkStart w:id="19" w:name="odd-moments"/>
     <w:p>
       <w:pPr>
         <w:pStyle w:val="Heading2"/>
@@ -11329,8 +11335,8 @@
         <w:t xml:space="preserve">I have kept that decision. I am not sure whether it was a vow or a mistake. I know only that it was made out of love, and that love does not always make the wisest decisions, but it makes the ones that last.</w:t>
       </w:r>
     </w:p>
-    <w:bookmarkEnd w:id="20"/>
-    <w:bookmarkStart w:id="21" w:name="the-search"/>
+    <w:bookmarkEnd w:id="19"/>
+    <w:bookmarkStart w:id="20" w:name="the-search"/>
     <w:p>
       <w:pPr>
         <w:pStyle w:val="Heading2"/>
@@ -12180,8 +12186,8 @@
         <w:t xml:space="preserve">on the sheet. I put a star beside it, and a second, and I did not know what they meant.</w:t>
       </w:r>
     </w:p>
-    <w:bookmarkEnd w:id="21"/>
-    <w:bookmarkStart w:id="22" w:name="the-phonetician"/>
+    <w:bookmarkEnd w:id="20"/>
+    <w:bookmarkStart w:id="21" w:name="the-phonetician"/>
     <w:p>
       <w:pPr>
         <w:pStyle w:val="Heading2"/>
@@ -13987,8 +13993,8 @@
         <w:t xml:space="preserve">I was right. There were thirty more. But Mira and Jonas were the first, and they were the ones who stayed.</w:t>
       </w:r>
     </w:p>
-    <w:bookmarkEnd w:id="22"/>
-    <w:bookmarkStart w:id="23" w:name="under-cover"/>
+    <w:bookmarkEnd w:id="21"/>
+    <w:bookmarkStart w:id="22" w:name="under-cover"/>
     <w:p>
       <w:pPr>
         <w:pStyle w:val="Heading2"/>
@@ -15523,8 +15529,8 @@
         <w:t xml:space="preserve">I did not know yet whether it was a promise or a warning. I know now that it was both.</w:t>
       </w:r>
     </w:p>
-    <w:bookmarkEnd w:id="23"/>
-    <w:bookmarkStart w:id="24" w:name="munich"/>
+    <w:bookmarkEnd w:id="22"/>
+    <w:bookmarkStart w:id="23" w:name="munich"/>
     <w:p>
       <w:pPr>
         <w:pStyle w:val="Heading2"/>
@@ -16795,8 +16801,8 @@
         <w:t xml:space="preserve">I have thought many times since that this was my first real mistake. I was not wrong to protect her. But I should have known that a secret kept from one’s friends is a secret that begins to work for someone else.</w:t>
       </w:r>
     </w:p>
-    <w:bookmarkEnd w:id="24"/>
-    <w:bookmarkStart w:id="25" w:name="the-prize"/>
+    <w:bookmarkEnd w:id="23"/>
+    <w:bookmarkStart w:id="24" w:name="the-prize"/>
     <w:p>
       <w:pPr>
         <w:pStyle w:val="Heading2"/>
@@ -18344,8 +18350,8 @@
         <w:t xml:space="preserve">I did it, as I always did. It was the one thing I was sure of.</w:t>
       </w:r>
     </w:p>
-    <w:bookmarkEnd w:id="25"/>
-    <w:bookmarkStart w:id="26" w:name="the-child"/>
+    <w:bookmarkEnd w:id="24"/>
+    <w:bookmarkStart w:id="25" w:name="the-child"/>
     <w:p>
       <w:pPr>
         <w:pStyle w:val="Heading2"/>
@@ -19624,8 +19630,8 @@
         <w:t xml:space="preserve">She fell asleep against me, in the dark. I did not move for a long time. Somewhere below, in the courtyard, someone was singing under their breath, and I listened, as I always do, and I thought that I had finally been given an answer, and that it was not one I could have found by thinking.</w:t>
       </w:r>
     </w:p>
-    <w:bookmarkEnd w:id="26"/>
-    <w:bookmarkStart w:id="27" w:name="restart"/>
+    <w:bookmarkEnd w:id="25"/>
+    <w:bookmarkStart w:id="26" w:name="restart"/>
     <w:p>
       <w:pPr>
         <w:pStyle w:val="Heading2"/>
@@ -21088,8 +21094,8 @@
         <w:t xml:space="preserve">Then I put the pen away, and went to bed, and slept, for the first time in many weeks, without dreaming of a refrigerator.</w:t>
       </w:r>
     </w:p>
-    <w:bookmarkEnd w:id="27"/>
-    <w:bookmarkStart w:id="28" w:name="the-foundation"/>
+    <w:bookmarkEnd w:id="26"/>
+    <w:bookmarkStart w:id="27" w:name="the-foundation"/>
     <w:p>
       <w:pPr>
         <w:pStyle w:val="Heading2"/>
@@ -22435,8 +22441,8 @@
         <w:t xml:space="preserve">I went.</w:t>
       </w:r>
     </w:p>
-    <w:bookmarkEnd w:id="28"/>
-    <w:bookmarkStart w:id="29" w:name="the-cabinet"/>
+    <w:bookmarkEnd w:id="27"/>
+    <w:bookmarkStart w:id="28" w:name="the-cabinet"/>
     <w:p>
       <w:pPr>
         <w:pStyle w:val="Heading2"/>
@@ -24452,8 +24458,8 @@
         <w:t xml:space="preserve">“I’ve been trying to say it for three weeks.”</w:t>
       </w:r>
     </w:p>
-    <w:bookmarkEnd w:id="29"/>
-    <w:bookmarkStart w:id="30" w:name="more-than-enough"/>
+    <w:bookmarkEnd w:id="28"/>
+    <w:bookmarkStart w:id="29" w:name="more-than-enough"/>
     <w:p>
       <w:pPr>
         <w:pStyle w:val="Heading2"/>
@@ -25728,8 +25734,8 @@
         <w:t xml:space="preserve">In the corridor, a cart went by with a rattling wheel. I counted eleven seconds. I did not look round.</w:t>
       </w:r>
     </w:p>
-    <w:bookmarkEnd w:id="30"/>
-    <w:bookmarkStart w:id="31" w:name="four-question-marks"/>
+    <w:bookmarkEnd w:id="29"/>
+    <w:bookmarkStart w:id="30" w:name="four-question-marks"/>
     <w:p>
       <w:pPr>
         <w:pStyle w:val="Heading2"/>
@@ -27606,8 +27612,8 @@
         <w:t xml:space="preserve">It does not scan. It is the best I have done.</w:t>
       </w:r>
     </w:p>
-    <w:bookmarkEnd w:id="31"/>
-    <w:bookmarkStart w:id="32" w:name="the-leak"/>
+    <w:bookmarkEnd w:id="30"/>
+    <w:bookmarkStart w:id="31" w:name="the-leak"/>
     <w:p>
       <w:pPr>
         <w:pStyle w:val="Heading2"/>
@@ -30143,8 +30149,8 @@
         <w:t xml:space="preserve">It was true. That was the worst of it. It was entirely true.</w:t>
       </w:r>
     </w:p>
-    <w:bookmarkEnd w:id="32"/>
-    <w:bookmarkStart w:id="33" w:name="the-draft"/>
+    <w:bookmarkEnd w:id="31"/>
+    <w:bookmarkStart w:id="32" w:name="the-draft"/>
     <w:p>
       <w:pPr>
         <w:pStyle w:val="Heading2"/>
@@ -31876,8 +31882,8 @@
         <w:t xml:space="preserve">On Thursday morning I went to work.</w:t>
       </w:r>
     </w:p>
-    <w:bookmarkEnd w:id="33"/>
-    <w:bookmarkStart w:id="34" w:name="duck-and-rabbit"/>
+    <w:bookmarkEnd w:id="32"/>
+    <w:bookmarkStart w:id="33" w:name="duck-and-rabbit"/>
     <w:p>
       <w:pPr>
         <w:pStyle w:val="Heading2"/>
@@ -33909,8 +33915,8 @@
         <w:t xml:space="preserve">She nodded gravely, as though this were quite ordinary, which, to her, it was. She slid down from my knee and went to find the cake.</w:t>
       </w:r>
     </w:p>
-    <w:bookmarkEnd w:id="34"/>
-    <w:bookmarkStart w:id="35" w:name="the-four-minutes"/>
+    <w:bookmarkEnd w:id="33"/>
+    <w:bookmarkStart w:id="34" w:name="the-four-minutes"/>
     <w:p>
       <w:pPr>
         <w:pStyle w:val="Heading2"/>
@@ -35534,9 +35540,9 @@
         </w:pict>
       </w:r>
     </w:p>
+    <w:bookmarkEnd w:id="34"/>
     <w:bookmarkEnd w:id="35"/>
-    <w:bookmarkEnd w:id="36"/>
-    <w:bookmarkStart w:id="54" w:name="appendix-the-science-behind-the-story"/>
+    <w:bookmarkStart w:id="53" w:name="appendix-the-science-behind-the-story"/>
     <w:p>
       <w:pPr>
         <w:pStyle w:val="Heading1"/>
@@ -35560,7 +35566,7 @@
         <w:t xml:space="preserve">This book is fiction, and its central scientific premise is invented. The rules of inheritance it uses are real. This appendix separates the two.</w:t>
       </w:r>
     </w:p>
-    <w:bookmarkStart w:id="39" w:name="how-inheritance-works"/>
+    <w:bookmarkStart w:id="38" w:name="how-inheritance-works"/>
     <w:p>
       <w:pPr>
         <w:pStyle w:val="Heading2"/>
@@ -35612,7 +35618,7 @@
         </w:rPr>
         <w:t xml:space="preserve"> </w:t>
       </w:r>
-      <w:hyperlink r:id="rId37">
+      <w:hyperlink r:id="rId36">
         <w:r>
           <w:rPr>
             <w:rStyle w:val="Hyperlink"/>
@@ -35657,7 +35663,7 @@
         </w:rPr>
         <w:t xml:space="preserve"> </w:t>
       </w:r>
-      <w:hyperlink r:id="rId38">
+      <w:hyperlink r:id="rId37">
         <w:r>
           <w:rPr>
             <w:rStyle w:val="Hyperlink"/>
@@ -36037,8 +36043,8 @@
         <w:t xml:space="preserve">is unlikely to pass intact to one child, and why the story treats reassembly as a matter of odds.</w:t>
       </w:r>
     </w:p>
-    <w:bookmarkEnd w:id="39"/>
-    <w:bookmarkStart w:id="40" w:name="germline-and-body-cells"/>
+    <w:bookmarkEnd w:id="38"/>
+    <w:bookmarkStart w:id="39" w:name="germline-and-body-cells"/>
     <w:p>
       <w:pPr>
         <w:pStyle w:val="Heading2"/>
@@ -36138,8 +36144,8 @@
         <w:t xml:space="preserve">: some cells carry the change and others do not. It also risks unintended changes elsewhere in the genome. The story passes over these problems, because Stone’s work is secret and the narrator does not describe it.</w:t>
       </w:r>
     </w:p>
-    <w:bookmarkEnd w:id="40"/>
-    <w:bookmarkStart w:id="47" w:name="gene-technology"/>
+    <w:bookmarkEnd w:id="39"/>
+    <w:bookmarkStart w:id="46" w:name="gene-technology"/>
     <w:p>
       <w:pPr>
         <w:pStyle w:val="Heading2"/>
@@ -36167,7 +36173,7 @@
         </w:rPr>
         <w:t xml:space="preserve"> </w:t>
       </w:r>
-      <w:hyperlink r:id="rId41">
+      <w:hyperlink r:id="rId40">
         <w:r>
           <w:rPr>
             <w:rStyle w:val="Hyperlink"/>
@@ -36204,7 +36210,7 @@
         </w:rPr>
         <w:t xml:space="preserve"> </w:t>
       </w:r>
-      <w:hyperlink r:id="rId42">
+      <w:hyperlink r:id="rId41">
         <w:r>
           <w:rPr>
             <w:rStyle w:val="Hyperlink"/>
@@ -36225,7 +36231,7 @@
         </w:rPr>
         <w:t xml:space="preserve"> </w:t>
       </w:r>
-      <w:hyperlink r:id="rId43">
+      <w:hyperlink r:id="rId42">
         <w:r>
           <w:rPr>
             <w:rStyle w:val="Hyperlink"/>
@@ -36246,7 +36252,7 @@
         </w:rPr>
         <w:t xml:space="preserve"> </w:t>
       </w:r>
-      <w:hyperlink r:id="rId44">
+      <w:hyperlink r:id="rId43">
         <w:r>
           <w:rPr>
             <w:rStyle w:val="Hyperlink"/>
@@ -36284,7 +36290,7 @@
         </w:rPr>
         <w:t xml:space="preserve"> </w:t>
       </w:r>
-      <w:hyperlink r:id="rId45">
+      <w:hyperlink r:id="rId44">
         <w:r>
           <w:rPr>
             <w:rStyle w:val="Hyperlink"/>
@@ -36311,7 +36317,7 @@
         </w:rPr>
         <w:t xml:space="preserve"> </w:t>
       </w:r>
-      <w:hyperlink r:id="rId46">
+      <w:hyperlink r:id="rId45">
         <w:r>
           <w:rPr>
             <w:rStyle w:val="Hyperlink"/>
@@ -36333,8 +36339,8 @@
         <w:t xml:space="preserve">first signed in December 2015, and renewed since, bars the Food and Drug Administration from reviewing applications to begin clinical research in which a human embryo is intentionally modified to carry a heritable change. Both facts bear on the book’s setting and its characters’ choice to stay hidden.</w:t>
       </w:r>
     </w:p>
-    <w:bookmarkEnd w:id="47"/>
-    <w:bookmarkStart w:id="49" w:name="intelligence-and-the-cognitive-package"/>
+    <w:bookmarkEnd w:id="46"/>
+    <w:bookmarkStart w:id="48" w:name="intelligence-and-the-cognitive-package"/>
     <w:p>
       <w:pPr>
         <w:pStyle w:val="Heading2"/>
@@ -36406,7 +36412,7 @@
         </w:rPr>
         <w:t xml:space="preserve"> </w:t>
       </w:r>
-      <w:hyperlink r:id="rId48">
+      <w:hyperlink r:id="rId47">
         <w:r>
           <w:rPr>
             <w:rStyle w:val="Hyperlink"/>
@@ -36422,8 +36428,8 @@
         <w:t xml:space="preserve">, but the known variants predict only a modest part of individual differences. There is no known set of dozens of edits that would produce an Einstein.</w:t>
       </w:r>
     </w:p>
-    <w:bookmarkEnd w:id="49"/>
-    <w:bookmarkStart w:id="51" w:name="the-dolphin-package"/>
+    <w:bookmarkEnd w:id="48"/>
+    <w:bookmarkStart w:id="50" w:name="the-dolphin-package"/>
     <w:p>
       <w:pPr>
         <w:pStyle w:val="Heading2"/>
@@ -36451,7 +36457,7 @@
         </w:rPr>
         <w:t xml:space="preserve"> </w:t>
       </w:r>
-      <w:hyperlink r:id="rId50">
+      <w:hyperlink r:id="rId49">
         <w:r>
           <w:rPr>
             <w:rStyle w:val="Hyperlink"/>
@@ -36478,32 +36484,32 @@
         <w:t xml:space="preserve">The book’s claim, that rewritten circuits in a human brain could give echo-resolution and social prediction from partial sounds, is invented. No such edit is known, and the book does not describe one. This is deliberate. It keeps the story about people and consequences, not methods.</w:t>
       </w:r>
     </w:p>
+    <w:bookmarkEnd w:id="50"/>
+    <w:bookmarkStart w:id="51" w:name="detection"/>
+    <w:p>
+      <w:pPr>
+        <w:pStyle w:val="Heading2"/>
+      </w:pPr>
+      <w:r>
+        <w:rPr>
+          <w:lang w:val="en-US"/>
+        </w:rPr>
+        <w:t xml:space="preserve">6. Detection</w:t>
+      </w:r>
+    </w:p>
+    <w:p>
+      <w:pPr>
+        <w:pStyle w:val="FirstParagraph"/>
+      </w:pPr>
+      <w:r>
+        <w:rPr>
+          <w:lang w:val="en-US"/>
+        </w:rPr>
+        <w:t xml:space="preserve">Whole-genome sequencing reads a person’s DNA and compares it to a reference. Stretches that do not match the human reference can stand out, which is the basis of the story’s fear of detection. Consumer ancestry and health tests look at selected positions only, and would not reveal most of what the book describes.</w:t>
+      </w:r>
+    </w:p>
     <w:bookmarkEnd w:id="51"/>
-    <w:bookmarkStart w:id="52" w:name="detection"/>
-    <w:p>
-      <w:pPr>
-        <w:pStyle w:val="Heading2"/>
-      </w:pPr>
-      <w:r>
-        <w:rPr>
-          <w:lang w:val="en-US"/>
-        </w:rPr>
-        <w:t xml:space="preserve">6. Detection</w:t>
-      </w:r>
-    </w:p>
-    <w:p>
-      <w:pPr>
-        <w:pStyle w:val="FirstParagraph"/>
-      </w:pPr>
-      <w:r>
-        <w:rPr>
-          <w:lang w:val="en-US"/>
-        </w:rPr>
-        <w:t xml:space="preserve">Whole-genome sequencing reads a person’s DNA and compares it to a reference. Stretches that do not match the human reference can stand out, which is the basis of the story’s fear of detection. Consumer ancestry and health tests look at selected positions only, and would not reveal most of what the book describes.</w:t>
-      </w:r>
-    </w:p>
-    <w:bookmarkEnd w:id="52"/>
-    <w:bookmarkStart w:id="53" w:name="what-is-fact-and-what-is-fiction"/>
+    <w:bookmarkStart w:id="52" w:name="what-is-fact-and-what-is-fiction"/>
     <w:p>
       <w:pPr>
         <w:pStyle w:val="Heading2"/>
@@ -36837,9 +36843,9 @@
         </w:pict>
       </w:r>
     </w:p>
+    <w:bookmarkEnd w:id="52"/>
     <w:bookmarkEnd w:id="53"/>
-    <w:bookmarkEnd w:id="54"/>
-    <w:bookmarkStart w:id="60" w:name="notes-and-further-reading"/>
+    <w:bookmarkStart w:id="59" w:name="notes-and-further-reading"/>
     <w:p>
       <w:pPr>
         <w:pStyle w:val="Heading1"/>
@@ -36882,7 +36888,7 @@
         </w:rPr>
         <w:t xml:space="preserve"> </w:t>
       </w:r>
-      <w:hyperlink r:id="rId37">
+      <w:hyperlink r:id="rId36">
         <w:r>
           <w:rPr>
             <w:rStyle w:val="Hyperlink"/>
@@ -37031,7 +37037,7 @@
         </w:rPr>
         <w:t xml:space="preserve"> </w:t>
       </w:r>
-      <w:hyperlink r:id="rId55">
+      <w:hyperlink r:id="rId54">
         <w:r>
           <w:rPr>
             <w:rStyle w:val="Hyperlink"/>
@@ -37065,7 +37071,7 @@
         </w:rPr>
         <w:t xml:space="preserve"> </w:t>
       </w:r>
-      <w:hyperlink r:id="rId38">
+      <w:hyperlink r:id="rId37">
         <w:r>
           <w:rPr>
             <w:rStyle w:val="Hyperlink"/>
@@ -37111,7 +37117,7 @@
         </w:rPr>
         <w:t xml:space="preserve"> </w:t>
       </w:r>
-      <w:hyperlink r:id="rId41">
+      <w:hyperlink r:id="rId40">
         <w:r>
           <w:rPr>
             <w:rStyle w:val="Hyperlink"/>
@@ -37158,7 +37164,7 @@
         </w:rPr>
         <w:t xml:space="preserve"> </w:t>
       </w:r>
-      <w:hyperlink r:id="rId42">
+      <w:hyperlink r:id="rId41">
         <w:r>
           <w:rPr>
             <w:rStyle w:val="Hyperlink"/>
@@ -37204,7 +37210,7 @@
         </w:rPr>
         <w:t xml:space="preserve">Liang, P., et al. </w:t>
       </w:r>
-      <w:hyperlink r:id="rId43">
+      <w:hyperlink r:id="rId42">
         <w:r>
           <w:rPr>
             <w:rStyle w:val="Hyperlink"/>
@@ -37264,7 +37270,7 @@
         </w:rPr>
         <w:t xml:space="preserve"> </w:t>
       </w:r>
-      <w:hyperlink r:id="rId44">
+      <w:hyperlink r:id="rId43">
         <w:r>
           <w:rPr>
             <w:rStyle w:val="Hyperlink"/>
@@ -37318,7 +37324,7 @@
         </w:rPr>
         <w:t xml:space="preserve"> </w:t>
       </w:r>
-      <w:hyperlink r:id="rId45">
+      <w:hyperlink r:id="rId44">
         <w:r>
           <w:rPr>
             <w:rStyle w:val="Hyperlink"/>
@@ -37345,7 +37351,7 @@
         </w:rPr>
         <w:t xml:space="preserve"> </w:t>
       </w:r>
-      <w:hyperlink r:id="rId56">
+      <w:hyperlink r:id="rId55">
         <w:r>
           <w:rPr>
             <w:rStyle w:val="Hyperlink"/>
@@ -37372,7 +37378,7 @@
         </w:rPr>
         <w:t xml:space="preserve"> </w:t>
       </w:r>
-      <w:hyperlink r:id="rId46">
+      <w:hyperlink r:id="rId45">
         <w:r>
           <w:rPr>
             <w:rStyle w:val="Hyperlink"/>
@@ -37399,7 +37405,7 @@
         </w:rPr>
         <w:t xml:space="preserve"> </w:t>
       </w:r>
-      <w:hyperlink r:id="rId57">
+      <w:hyperlink r:id="rId56">
         <w:r>
           <w:rPr>
             <w:rStyle w:val="Hyperlink"/>
@@ -37451,7 +37457,7 @@
         </w:rPr>
         <w:t xml:space="preserve"> </w:t>
       </w:r>
-      <w:hyperlink r:id="rId48">
+      <w:hyperlink r:id="rId47">
         <w:r>
           <w:rPr>
             <w:rStyle w:val="Hyperlink"/>
@@ -37523,7 +37529,7 @@
         </w:rPr>
         <w:t xml:space="preserve"> </w:t>
       </w:r>
-      <w:hyperlink r:id="rId50">
+      <w:hyperlink r:id="rId49">
         <w:r>
           <w:rPr>
             <w:rStyle w:val="Hyperlink"/>
@@ -37732,11 +37738,10 @@
         </w:pict>
       </w:r>
     </w:p>
-    <w:bookmarkStart w:id="59" w:name="the-fiction-this-book-keeps-company-with"/>
+    <w:bookmarkStart w:id="58" w:name="the-fiction-this-book-keeps-company-with"/>
     <w:p>
       <w:pPr>
         <w:pStyle w:val="Heading2"/>
-        <w:pageBreakBefore/>
       </w:pPr>
       <w:r>
         <w:rPr>
@@ -37765,7 +37770,7 @@
         </w:rPr>
         <w:t xml:space="preserve"> </w:t>
       </w:r>
-      <w:hyperlink r:id="rId58">
+      <w:hyperlink r:id="rId57">
         <w:r>
           <w:rPr>
             <w:rStyle w:val="Hyperlink"/>
@@ -37993,8 +37998,693 @@
         <w:t xml:space="preserve">Film, 1997.</w:t>
       </w:r>
     </w:p>
+    <w:p>
+      <w:r>
+        <w:pict>
+          <v:rect style="width:0;height:1.5pt" o:hralign="center" o:hrstd="t" o:hr="t"/>
+        </w:pict>
+      </w:r>
+    </w:p>
+    <w:bookmarkEnd w:id="58"/>
     <w:bookmarkEnd w:id="59"/>
+    <w:bookmarkStart w:id="60" w:name="about-the-author"/>
+    <w:p>
+      <w:pPr>
+        <w:pStyle w:val="Heading1"/>
+        <w:pageBreakBefore/>
+      </w:pPr>
+      <w:r>
+        <w:rPr>
+          <w:lang w:val="en-US"/>
+        </w:rPr>
+        <w:t xml:space="preserve">About the Author</w:t>
+      </w:r>
+    </w:p>
+    <w:p>
+      <w:pPr>
+        <w:pStyle w:val="FirstParagraph"/>
+      </w:pPr>
+      <w:r>
+        <w:rPr>
+          <w:lang w:val="en-US"/>
+        </w:rPr>
+        <w:t xml:space="preserve">Frank Stone is a pseudonym. It is also the name of the fertility doctor in this book, a coincidence the author has chosen not to annotate, in keeping with the doctor’s own methods.</w:t>
+      </w:r>
+    </w:p>
+    <w:p>
+      <w:pPr>
+        <w:pStyle w:val="BodyText"/>
+      </w:pPr>
+      <w:r>
+        <w:rPr>
+          <w:lang w:val="en-US"/>
+        </w:rPr>
+        <w:t xml:space="preserve">Lothar J. Musiol is a graduate of Munich University of Applied Sciences who spent more than forty years in the semiconductor industry, first at Germany’s largest company in the field, then at a string of American start-ups. He studied physics alongside all of it, seriously enough to know exactly how much he is simplifying. Dual citizenship, put to its most sensible use, lets him split his time between San Clemente, California, and Passau, Bavaria, where Austria begins at the garden fence. The household includes one married daughter, one grumpy Teacup Pomeranian named Gucci, and eleven chickens, listed in order of seniority rather than volume.</w:t>
+      </w:r>
+    </w:p>
+    <w:p>
+      <w:pPr>
+        <w:pStyle w:val="BodyText"/>
+      </w:pPr>
+      <w:r>
+        <w:rPr>
+          <w:lang w:val="en-US"/>
+        </w:rPr>
+        <w:t xml:space="preserve">He writes to make complex ideas clearer and more engaging than most treatments manage, without ever pretending they are simpler than they actually are.</w:t>
+      </w:r>
+    </w:p>
+    <w:p>
+      <w:r>
+        <w:pict>
+          <v:rect style="width:0;height:1.5pt" o:hralign="center" o:hrstd="t" o:hr="t"/>
+        </w:pict>
+      </w:r>
+    </w:p>
     <w:bookmarkEnd w:id="60"/>
+    <w:bookmarkStart w:id="61" w:name="also-by-lothar-j.-musiol"/>
+    <w:p>
+      <w:pPr>
+        <w:pStyle w:val="Heading1"/>
+        <w:pageBreakBefore/>
+      </w:pPr>
+      <w:r>
+        <w:rPr>
+          <w:lang w:val="en-US"/>
+        </w:rPr>
+        <w:t xml:space="preserve">Also by Lothar J. Musiol</w:t>
+      </w:r>
+    </w:p>
+    <w:p>
+      <w:pPr>
+        <w:pStyle w:val="FirstParagraph"/>
+      </w:pPr>
+      <w:r>
+        <w:rPr>
+          <w:b/>
+          <w:bCs/>
+          <w:lang w:val="en-US"/>
+        </w:rPr>
+        <w:t xml:space="preserve">Physics, Actually</w:t>
+      </w:r>
+    </w:p>
+    <w:p>
+      <w:pPr>
+        <w:pStyle w:val="Compact"/>
+        <w:numPr>
+          <w:ilvl w:val="0"/>
+          <w:numId w:val="1002"/>
+        </w:numPr>
+      </w:pPr>
+      <w:r>
+        <w:rPr>
+          <w:lang w:val="en-US"/>
+        </w:rPr>
+        <w:t xml:space="preserve">Physics, Actually, Volume 1: Motion, Forces, Time, and Relativity</w:t>
+      </w:r>
+    </w:p>
+    <w:p>
+      <w:pPr>
+        <w:pStyle w:val="Compact"/>
+        <w:numPr>
+          <w:ilvl w:val="0"/>
+          <w:numId w:val="1002"/>
+        </w:numPr>
+      </w:pPr>
+      <w:r>
+        <w:rPr>
+          <w:lang w:val="en-US"/>
+        </w:rPr>
+        <w:t xml:space="preserve">Physics, Actually, Volume 2: Gravity, Cosmology, and the Limits of Spacetime</w:t>
+      </w:r>
+    </w:p>
+    <w:p>
+      <w:pPr>
+        <w:pStyle w:val="Compact"/>
+        <w:numPr>
+          <w:ilvl w:val="0"/>
+          <w:numId w:val="1002"/>
+        </w:numPr>
+      </w:pPr>
+      <w:r>
+        <w:rPr>
+          <w:lang w:val="en-US"/>
+        </w:rPr>
+        <w:t xml:space="preserve">Physics, Actually, Volume 3: The Standard Model, Chaos, and the Edge of Knowledge</w:t>
+      </w:r>
+    </w:p>
+    <w:p>
+      <w:pPr>
+        <w:pStyle w:val="Compact"/>
+        <w:numPr>
+          <w:ilvl w:val="0"/>
+          <w:numId w:val="1002"/>
+        </w:numPr>
+      </w:pPr>
+      <w:r>
+        <w:rPr>
+          <w:lang w:val="en-US"/>
+        </w:rPr>
+        <w:t xml:space="preserve">Life, Actually: From the First Cell to the Edited Genome and the Search for Life Elsewhere</w:t>
+      </w:r>
+    </w:p>
+    <w:p>
+      <w:pPr>
+        <w:pStyle w:val="FirstParagraph"/>
+      </w:pPr>
+      <w:r>
+        <w:rPr>
+          <w:b/>
+          <w:bCs/>
+          <w:lang w:val="en-US"/>
+        </w:rPr>
+        <w:t xml:space="preserve">More Actually Books</w:t>
+      </w:r>
+    </w:p>
+    <w:p>
+      <w:pPr>
+        <w:pStyle w:val="Compact"/>
+        <w:numPr>
+          <w:ilvl w:val="0"/>
+          <w:numId w:val="1003"/>
+        </w:numPr>
+      </w:pPr>
+      <w:r>
+        <w:rPr>
+          <w:lang w:val="en-US"/>
+        </w:rPr>
+        <w:t xml:space="preserve">Gravity, Actually: Einstein’s Relativity in Plain Words: Falling, Time, Black Holes, and the Waves We Finally Heard</w:t>
+      </w:r>
+    </w:p>
+    <w:p>
+      <w:pPr>
+        <w:pStyle w:val="Compact"/>
+        <w:numPr>
+          <w:ilvl w:val="0"/>
+          <w:numId w:val="1003"/>
+        </w:numPr>
+      </w:pPr>
+      <w:r>
+        <w:rPr>
+          <w:lang w:val="en-US"/>
+        </w:rPr>
+        <w:t xml:space="preserve">The Universe, Actually: What Humanity Currently Understands About Reality</w:t>
+      </w:r>
+    </w:p>
+    <w:p>
+      <w:pPr>
+        <w:pStyle w:val="FirstParagraph"/>
+      </w:pPr>
+      <w:r>
+        <w:rPr>
+          <w:b/>
+          <w:bCs/>
+          <w:lang w:val="en-US"/>
+        </w:rPr>
+        <w:t xml:space="preserve">Math, Actually</w:t>
+      </w:r>
+    </w:p>
+    <w:p>
+      <w:pPr>
+        <w:pStyle w:val="Compact"/>
+        <w:numPr>
+          <w:ilvl w:val="0"/>
+          <w:numId w:val="1004"/>
+        </w:numPr>
+      </w:pPr>
+      <w:r>
+        <w:rPr>
+          <w:lang w:val="en-US"/>
+        </w:rPr>
+        <w:t xml:space="preserve">Math, Actually, Volume 1: From Arithmetic to Calculus</w:t>
+      </w:r>
+    </w:p>
+    <w:p>
+      <w:pPr>
+        <w:pStyle w:val="Compact"/>
+        <w:numPr>
+          <w:ilvl w:val="0"/>
+          <w:numId w:val="1004"/>
+        </w:numPr>
+      </w:pPr>
+      <w:r>
+        <w:rPr>
+          <w:lang w:val="en-US"/>
+        </w:rPr>
+        <w:t xml:space="preserve">Math, Actually, Volume 2: From Multivariable Calculus to Set Theory &amp; Logic</w:t>
+      </w:r>
+    </w:p>
+    <w:p>
+      <w:pPr>
+        <w:pStyle w:val="Compact"/>
+        <w:numPr>
+          <w:ilvl w:val="0"/>
+          <w:numId w:val="1004"/>
+        </w:numPr>
+      </w:pPr>
+      <w:r>
+        <w:rPr>
+          <w:lang w:val="en-US"/>
+        </w:rPr>
+        <w:t xml:space="preserve">Math, Actually, Volume 3: From Differential Equations to Abstract Algebra</w:t>
+      </w:r>
+    </w:p>
+    <w:p>
+      <w:pPr>
+        <w:pStyle w:val="Compact"/>
+        <w:numPr>
+          <w:ilvl w:val="0"/>
+          <w:numId w:val="1004"/>
+        </w:numPr>
+      </w:pPr>
+      <w:r>
+        <w:rPr>
+          <w:lang w:val="en-US"/>
+        </w:rPr>
+        <w:t xml:space="preserve">Math, Actually, Volume 4: From Category Theory to the Frontier</w:t>
+      </w:r>
+    </w:p>
+    <w:p>
+      <w:pPr>
+        <w:pStyle w:val="FirstParagraph"/>
+      </w:pPr>
+      <w:r>
+        <w:rPr>
+          <w:b/>
+          <w:bCs/>
+          <w:lang w:val="en-US"/>
+        </w:rPr>
+        <w:t xml:space="preserve">Quantum, Actually</w:t>
+      </w:r>
+    </w:p>
+    <w:p>
+      <w:pPr>
+        <w:pStyle w:val="Compact"/>
+        <w:numPr>
+          <w:ilvl w:val="0"/>
+          <w:numId w:val="1005"/>
+        </w:numPr>
+      </w:pPr>
+      <w:r>
+        <w:rPr>
+          <w:lang w:val="en-US"/>
+        </w:rPr>
+        <w:t xml:space="preserve">Quantum, Actually, Volume 1: Questions and Answers from the Double Slit to the Superconducting Wire</w:t>
+      </w:r>
+    </w:p>
+    <w:p>
+      <w:pPr>
+        <w:pStyle w:val="Compact"/>
+        <w:numPr>
+          <w:ilvl w:val="0"/>
+          <w:numId w:val="1005"/>
+        </w:numPr>
+      </w:pPr>
+      <w:r>
+        <w:rPr>
+          <w:lang w:val="en-US"/>
+        </w:rPr>
+        <w:t xml:space="preserve">Quantum, Actually, Volume 2: A QED Course</w:t>
+      </w:r>
+    </w:p>
+    <w:p>
+      <w:pPr>
+        <w:pStyle w:val="FirstParagraph"/>
+      </w:pPr>
+      <w:r>
+        <w:rPr>
+          <w:b/>
+          <w:bCs/>
+          <w:lang w:val="en-US"/>
+        </w:rPr>
+        <w:t xml:space="preserve">Science Sparks</w:t>
+      </w:r>
+    </w:p>
+    <w:p>
+      <w:pPr>
+        <w:pStyle w:val="Compact"/>
+        <w:numPr>
+          <w:ilvl w:val="0"/>
+          <w:numId w:val="1006"/>
+        </w:numPr>
+      </w:pPr>
+      <w:r>
+        <w:rPr>
+          <w:lang w:val="en-US"/>
+        </w:rPr>
+        <w:t xml:space="preserve">Science Sparks: Physics, Life, and Mathematics — The Same Few Rules, Told in Highlights</w:t>
+      </w:r>
+    </w:p>
+    <w:p>
+      <w:pPr>
+        <w:pStyle w:val="FirstParagraph"/>
+      </w:pPr>
+      <w:r>
+        <w:rPr>
+          <w:b/>
+          <w:bCs/>
+          <w:lang w:val="en-US"/>
+        </w:rPr>
+        <w:t xml:space="preserve">Look First</w:t>
+      </w:r>
+    </w:p>
+    <w:p>
+      <w:pPr>
+        <w:pStyle w:val="Compact"/>
+        <w:numPr>
+          <w:ilvl w:val="0"/>
+          <w:numId w:val="1007"/>
+        </w:numPr>
+      </w:pPr>
+      <w:r>
+        <w:rPr>
+          <w:lang w:val="en-US"/>
+        </w:rPr>
+        <w:t xml:space="preserve">Look First, Volume 1: The Universe Has No Now</w:t>
+      </w:r>
+    </w:p>
+    <w:p>
+      <w:pPr>
+        <w:pStyle w:val="Compact"/>
+        <w:numPr>
+          <w:ilvl w:val="0"/>
+          <w:numId w:val="1007"/>
+        </w:numPr>
+      </w:pPr>
+      <w:r>
+        <w:rPr>
+          <w:lang w:val="en-US"/>
+        </w:rPr>
+        <w:t xml:space="preserve">Look First, Volume 2: A Trip Is Not a New Life</w:t>
+      </w:r>
+    </w:p>
+    <w:p>
+      <w:pPr>
+        <w:pStyle w:val="FirstParagraph"/>
+      </w:pPr>
+      <w:r>
+        <w:rPr>
+          <w:b/>
+          <w:bCs/>
+          <w:lang w:val="en-US"/>
+        </w:rPr>
+        <w:t xml:space="preserve">Electrical Engineering Series</w:t>
+      </w:r>
+    </w:p>
+    <w:p>
+      <w:pPr>
+        <w:pStyle w:val="Compact"/>
+        <w:numPr>
+          <w:ilvl w:val="0"/>
+          <w:numId w:val="1008"/>
+        </w:numPr>
+      </w:pPr>
+      <w:r>
+        <w:rPr>
+          <w:lang w:val="en-US"/>
+        </w:rPr>
+        <w:t xml:space="preserve">Foundations of Electronics (Book 1)</w:t>
+      </w:r>
+    </w:p>
+    <w:p>
+      <w:pPr>
+        <w:pStyle w:val="Compact"/>
+        <w:numPr>
+          <w:ilvl w:val="0"/>
+          <w:numId w:val="1008"/>
+        </w:numPr>
+      </w:pPr>
+      <w:r>
+        <w:rPr>
+          <w:lang w:val="en-US"/>
+        </w:rPr>
+        <w:t xml:space="preserve">Circuits, Components, and Control (Book 2)</w:t>
+      </w:r>
+    </w:p>
+    <w:p>
+      <w:pPr>
+        <w:pStyle w:val="Compact"/>
+        <w:numPr>
+          <w:ilvl w:val="0"/>
+          <w:numId w:val="1008"/>
+        </w:numPr>
+      </w:pPr>
+      <w:r>
+        <w:rPr>
+          <w:lang w:val="en-US"/>
+        </w:rPr>
+        <w:t xml:space="preserve">Semiconductor Physics and Devices (Book 3)</w:t>
+      </w:r>
+    </w:p>
+    <w:p>
+      <w:pPr>
+        <w:pStyle w:val="Compact"/>
+        <w:numPr>
+          <w:ilvl w:val="0"/>
+          <w:numId w:val="1008"/>
+        </w:numPr>
+      </w:pPr>
+      <w:r>
+        <w:rPr>
+          <w:lang w:val="en-US"/>
+        </w:rPr>
+        <w:t xml:space="preserve">RF, Microwave, and Transceivers (Book 4)</w:t>
+      </w:r>
+    </w:p>
+    <w:p>
+      <w:pPr>
+        <w:pStyle w:val="Compact"/>
+        <w:numPr>
+          <w:ilvl w:val="0"/>
+          <w:numId w:val="1008"/>
+        </w:numPr>
+      </w:pPr>
+      <w:r>
+        <w:rPr>
+          <w:lang w:val="en-US"/>
+        </w:rPr>
+        <w:t xml:space="preserve">Communications, Wireless, and SDR (Book 5)</w:t>
+      </w:r>
+    </w:p>
+    <w:p>
+      <w:pPr>
+        <w:pStyle w:val="Compact"/>
+        <w:numPr>
+          <w:ilvl w:val="0"/>
+          <w:numId w:val="1008"/>
+        </w:numPr>
+      </w:pPr>
+      <w:r>
+        <w:rPr>
+          <w:lang w:val="en-US"/>
+        </w:rPr>
+        <w:t xml:space="preserve">Power and Energy (Book 6)</w:t>
+      </w:r>
+    </w:p>
+    <w:p>
+      <w:pPr>
+        <w:pStyle w:val="Compact"/>
+        <w:numPr>
+          <w:ilvl w:val="0"/>
+          <w:numId w:val="1008"/>
+        </w:numPr>
+      </w:pPr>
+      <w:r>
+        <w:rPr>
+          <w:lang w:val="en-US"/>
+        </w:rPr>
+        <w:t xml:space="preserve">Packaging, Layout, EMC, and Test (Book 7)</w:t>
+      </w:r>
+    </w:p>
+    <w:p>
+      <w:pPr>
+        <w:pStyle w:val="Compact"/>
+        <w:numPr>
+          <w:ilvl w:val="0"/>
+          <w:numId w:val="1008"/>
+        </w:numPr>
+      </w:pPr>
+      <w:r>
+        <w:rPr>
+          <w:lang w:val="en-US"/>
+        </w:rPr>
+        <w:t xml:space="preserve">Firmware and Software for Electronics (Book 8)</w:t>
+      </w:r>
+    </w:p>
+    <w:p>
+      <w:pPr>
+        <w:pStyle w:val="Compact"/>
+        <w:numPr>
+          <w:ilvl w:val="0"/>
+          <w:numId w:val="1008"/>
+        </w:numPr>
+      </w:pPr>
+      <w:r>
+        <w:rPr>
+          <w:lang w:val="en-US"/>
+        </w:rPr>
+        <w:t xml:space="preserve">Test and Measurement Instruments (Book 9)</w:t>
+      </w:r>
+    </w:p>
+    <w:p>
+      <w:pPr>
+        <w:pStyle w:val="FirstParagraph"/>
+      </w:pPr>
+      <w:r>
+        <w:rPr>
+          <w:b/>
+          <w:bCs/>
+          <w:lang w:val="en-US"/>
+        </w:rPr>
+        <w:t xml:space="preserve">History</w:t>
+      </w:r>
+    </w:p>
+    <w:p>
+      <w:pPr>
+        <w:pStyle w:val="Compact"/>
+        <w:numPr>
+          <w:ilvl w:val="0"/>
+          <w:numId w:val="1009"/>
+        </w:numPr>
+      </w:pPr>
+      <w:r>
+        <w:rPr>
+          <w:lang w:val="en-US"/>
+        </w:rPr>
+        <w:t xml:space="preserve">The Dolphins’ View of History</w:t>
+      </w:r>
+    </w:p>
+    <w:p>
+      <w:pPr>
+        <w:pStyle w:val="FirstParagraph"/>
+      </w:pPr>
+      <w:r>
+        <w:rPr>
+          <w:b/>
+          <w:bCs/>
+          <w:lang w:val="en-US"/>
+        </w:rPr>
+        <w:t xml:space="preserve">Fiction</w:t>
+      </w:r>
+    </w:p>
+    <w:p>
+      <w:pPr>
+        <w:pStyle w:val="Compact"/>
+        <w:numPr>
+          <w:ilvl w:val="0"/>
+          <w:numId w:val="1010"/>
+        </w:numPr>
+      </w:pPr>
+      <w:r>
+        <w:rPr>
+          <w:lang w:val="en-US"/>
+        </w:rPr>
+        <w:t xml:space="preserve">The Murder That Hadn’t Happened Yet (The Relativistic Investigation Bureau, Book 1), Lothar J. Musiol writing as Spezala Genara Relavi (S.G.R.)</w:t>
+      </w:r>
+    </w:p>
+    <w:p>
+      <w:pPr>
+        <w:pStyle w:val="Compact"/>
+        <w:numPr>
+          <w:ilvl w:val="0"/>
+          <w:numId w:val="1010"/>
+        </w:numPr>
+      </w:pPr>
+      <w:r>
+        <w:rPr>
+          <w:lang w:val="en-US"/>
+        </w:rPr>
+        <w:t xml:space="preserve">The Warning That Was Sent Too Late (The Relativistic Investigation Bureau, Book 2), Lothar J. Musiol writing as Spezala Genara Relavi (S.G.R.)</w:t>
+      </w:r>
+    </w:p>
+    <w:p>
+      <w:pPr>
+        <w:pStyle w:val="Compact"/>
+        <w:numPr>
+          <w:ilvl w:val="0"/>
+          <w:numId w:val="1010"/>
+        </w:numPr>
+      </w:pPr>
+      <w:r>
+        <w:rPr>
+          <w:lang w:val="en-US"/>
+        </w:rPr>
+        <w:t xml:space="preserve">Schrödinger’s Paperwork (Lolly Wren’s Curious Science Adventures, Book 1), Lothar J. Musiol writing as Quentin Edmund Darling (Q.E.D.)</w:t>
+      </w:r>
+    </w:p>
+    <w:p>
+      <w:pPr>
+        <w:pStyle w:val="Compact"/>
+        <w:numPr>
+          <w:ilvl w:val="0"/>
+          <w:numId w:val="1010"/>
+        </w:numPr>
+      </w:pPr>
+      <w:r>
+        <w:rPr>
+          <w:lang w:val="en-US"/>
+        </w:rPr>
+        <w:t xml:space="preserve">The Permitted Options (Lolly Wren’s Curious Science Adventures, Book 2), Lothar J. Musiol writing as Quentin Edmund Darling (Q.E.D.)</w:t>
+      </w:r>
+    </w:p>
+    <w:p>
+      <w:pPr>
+        <w:pStyle w:val="Compact"/>
+        <w:numPr>
+          <w:ilvl w:val="0"/>
+          <w:numId w:val="1010"/>
+        </w:numPr>
+      </w:pPr>
+      <w:r>
+        <w:rPr>
+          <w:lang w:val="en-US"/>
+        </w:rPr>
+        <w:t xml:space="preserve">Protocol Flamingo (The Invasion Storybooks, Book 1), Lothar J. Musiol writing as George Herbert Fontaine</w:t>
+      </w:r>
+    </w:p>
+    <w:p>
+      <w:pPr>
+        <w:pStyle w:val="Compact"/>
+        <w:numPr>
+          <w:ilvl w:val="0"/>
+          <w:numId w:val="1010"/>
+        </w:numPr>
+      </w:pPr>
+      <w:r>
+        <w:rPr>
+          <w:lang w:val="en-US"/>
+        </w:rPr>
+        <w:t xml:space="preserve">In Love with Murder, Actually: A Derailed Mystery in Provence, Lothar J. Musiol writing as Romuald Livingston</w:t>
+      </w:r>
+    </w:p>
+    <w:p>
+      <w:pPr>
+        <w:pStyle w:val="FirstParagraph"/>
+      </w:pPr>
+      <w:r>
+        <w:rPr>
+          <w:b/>
+          <w:bCs/>
+          <w:lang w:val="en-US"/>
+        </w:rPr>
+        <w:t xml:space="preserve">In German</w:t>
+      </w:r>
+    </w:p>
+    <w:p>
+      <w:pPr>
+        <w:pStyle w:val="Compact"/>
+        <w:numPr>
+          <w:ilvl w:val="0"/>
+          <w:numId w:val="1011"/>
+        </w:numPr>
+      </w:pPr>
+      <w:r>
+        <w:rPr>
+          <w:lang w:val="en-US"/>
+        </w:rPr>
+        <w:t xml:space="preserve">Auswandern – Ab in die USA, Kanada, Australien oder Neuseeland?</w:t>
+      </w:r>
+    </w:p>
+    <w:bookmarkEnd w:id="61"/>
     <w:sectPr>
       <w:footnotePr>
         <w:numRestart w:val="eachSect"/>
@@ -38214,6 +38904,36 @@
     <w:abstractNumId w:val="990"/>
   </w:num>
   <w:num w:numId="1001">
+    <w:abstractNumId w:val="991"/>
+  </w:num>
+  <w:num w:numId="1002">
+    <w:abstractNumId w:val="991"/>
+  </w:num>
+  <w:num w:numId="1003">
+    <w:abstractNumId w:val="991"/>
+  </w:num>
+  <w:num w:numId="1004">
+    <w:abstractNumId w:val="991"/>
+  </w:num>
+  <w:num w:numId="1005">
+    <w:abstractNumId w:val="991"/>
+  </w:num>
+  <w:num w:numId="1006">
+    <w:abstractNumId w:val="991"/>
+  </w:num>
+  <w:num w:numId="1007">
+    <w:abstractNumId w:val="991"/>
+  </w:num>
+  <w:num w:numId="1008">
+    <w:abstractNumId w:val="991"/>
+  </w:num>
+  <w:num w:numId="1009">
+    <w:abstractNumId w:val="991"/>
+  </w:num>
+  <w:num w:numId="1010">
+    <w:abstractNumId w:val="991"/>
+  </w:num>
+  <w:num w:numId="1011">
     <w:abstractNumId w:val="991"/>
   </w:num>
 </w:numbering>

</xml_diff>

<commit_message>
Forbidden Offspring: pen name is now Frank N. Stone
Byline, pen-name paragraph, file metadata and standing notes updated; the scientist character stays Frank Stone.

Co-Authored-By: Claude Sonnet 5.5 <noreply@anthropic.com>
</commit_message>
<xml_diff>
--- a/Forbidden_Offspring/Forbidden_Offspring_v1.docx
+++ b/Forbidden_Offspring/Forbidden_Offspring_v1.docx
@@ -35,9 +35,46 @@
         <w:t xml:space="preserve">Lothar J. Musiol writing as Frank Stone</w:t>
       </w:r>
     </w:p>
+    <w:bookmarkStart w:id="9" w:name="forbidden-offspring"/>
+    <w:p>
+      <w:pPr>
+        <w:pStyle w:val="Heading1"/>
+        <w:pageBreakBefore/>
+      </w:pPr>
+      <w:r>
+        <w:rPr>
+          <w:lang w:val="en-US"/>
+        </w:rPr>
+        <w:t xml:space="preserve">Forbidden Offspring</w:t>
+      </w:r>
+    </w:p>
     <w:p>
       <w:pPr>
         <w:pStyle w:val="FirstParagraph"/>
+      </w:pPr>
+      <w:r>
+        <w:rPr>
+          <w:i/>
+          <w:iCs/>
+          <w:lang w:val="en-US"/>
+        </w:rPr>
+        <w:t xml:space="preserve">A novel</w:t>
+      </w:r>
+    </w:p>
+    <w:p>
+      <w:pPr>
+        <w:pStyle w:val="BodyText"/>
+      </w:pPr>
+      <w:r>
+        <w:rPr>
+          <w:lang w:val="en-US"/>
+        </w:rPr>
+        <w:t xml:space="preserve">Lothar J. Musiol writing as Frank N. Stone</w:t>
+      </w:r>
+    </w:p>
+    <w:p>
+      <w:pPr>
+        <w:pStyle w:val="BodyText"/>
       </w:pPr>
       <w:r>
         <w:rPr>
@@ -64,7 +101,8 @@
         </w:pict>
       </w:r>
     </w:p>
-    <w:bookmarkStart w:id="9" w:name="consent"/>
+    <w:bookmarkEnd w:id="9"/>
+    <w:bookmarkStart w:id="10" w:name="consent"/>
     <w:p>
       <w:pPr>
         <w:pStyle w:val="Heading1"/>
@@ -452,8 +490,8 @@
         <w:t xml:space="preserve">none.</w:t>
       </w:r>
     </w:p>
-    <w:bookmarkEnd w:id="9"/>
-    <w:bookmarkStart w:id="17" w:name="part-one-stone"/>
+    <w:bookmarkEnd w:id="10"/>
+    <w:bookmarkStart w:id="18" w:name="part-one-stone"/>
     <w:p>
       <w:pPr>
         <w:pStyle w:val="Heading1"/>
@@ -466,7 +504,7 @@
         <w:t xml:space="preserve">PART ONE: STONE</w:t>
       </w:r>
     </w:p>
-    <w:bookmarkStart w:id="10" w:name="four-minutes"/>
+    <w:bookmarkStart w:id="11" w:name="four-minutes"/>
     <w:p>
       <w:pPr>
         <w:pStyle w:val="Heading2"/>
@@ -1356,8 +1394,8 @@
         <w:t xml:space="preserve">I kept the handshake a good while longer than I needed to.</w:t>
       </w:r>
     </w:p>
-    <w:bookmarkEnd w:id="10"/>
-    <w:bookmarkStart w:id="11" w:name="test-time"/>
+    <w:bookmarkEnd w:id="11"/>
+    <w:bookmarkStart w:id="12" w:name="test-time"/>
     <w:p>
       <w:pPr>
         <w:pStyle w:val="Heading2"/>
@@ -2501,8 +2539,8 @@
         <w:t xml:space="preserve">I have thought since that I was wrong to call her a subject. She was a person who had noticed me. It is a rarer thing than most men think.</w:t>
       </w:r>
     </w:p>
-    <w:bookmarkEnd w:id="11"/>
-    <w:bookmarkStart w:id="12" w:name="the-ledger"/>
+    <w:bookmarkEnd w:id="12"/>
+    <w:bookmarkStart w:id="13" w:name="the-ledger"/>
     <w:p>
       <w:pPr>
         <w:pStyle w:val="Heading2"/>
@@ -3458,8 +3496,8 @@
         <w:t xml:space="preserve">I had been in that room perhaps twice. I had never listened to it.</w:t>
       </w:r>
     </w:p>
-    <w:bookmarkEnd w:id="12"/>
-    <w:bookmarkStart w:id="13" w:name="the-second-listener"/>
+    <w:bookmarkEnd w:id="13"/>
+    <w:bookmarkStart w:id="14" w:name="the-second-listener"/>
     <w:p>
       <w:pPr>
         <w:pStyle w:val="Heading2"/>
@@ -4208,8 +4246,8 @@
         <w:t xml:space="preserve">That was the first night of the account you are reading.</w:t>
       </w:r>
     </w:p>
-    <w:bookmarkEnd w:id="13"/>
-    <w:bookmarkStart w:id="14" w:name="the-apartment"/>
+    <w:bookmarkEnd w:id="14"/>
+    <w:bookmarkStart w:id="15" w:name="the-apartment"/>
     <w:p>
       <w:pPr>
         <w:pStyle w:val="Heading2"/>
@@ -5840,8 +5878,8 @@
         <w:t xml:space="preserve">I do not think he intended it as a joke.</w:t>
       </w:r>
     </w:p>
-    <w:bookmarkEnd w:id="14"/>
-    <w:bookmarkStart w:id="15" w:name="the-bargain"/>
+    <w:bookmarkEnd w:id="15"/>
+    <w:bookmarkStart w:id="16" w:name="the-bargain"/>
     <w:p>
       <w:pPr>
         <w:pStyle w:val="Heading2"/>
@@ -7244,8 +7282,8 @@
         <w:t xml:space="preserve">It was the first time I had ever thought of it as an accident.</w:t>
       </w:r>
     </w:p>
-    <w:bookmarkEnd w:id="15"/>
-    <w:bookmarkStart w:id="16" w:name="the-stroke"/>
+    <w:bookmarkEnd w:id="16"/>
+    <w:bookmarkStart w:id="17" w:name="the-stroke"/>
     <w:p>
       <w:pPr>
         <w:pStyle w:val="Heading2"/>
@@ -8162,9 +8200,9 @@
         <w:t xml:space="preserve">pen</w:t>
       </w:r>
     </w:p>
-    <w:bookmarkEnd w:id="16"/>
     <w:bookmarkEnd w:id="17"/>
-    <w:bookmarkStart w:id="35" w:name="part-two-the-offspring"/>
+    <w:bookmarkEnd w:id="18"/>
+    <w:bookmarkStart w:id="36" w:name="part-two-the-offspring"/>
     <w:p>
       <w:pPr>
         <w:pStyle w:val="Heading1"/>
@@ -8177,7 +8215,7 @@
         <w:t xml:space="preserve">PART TWO: THE OFFSPRING</w:t>
       </w:r>
     </w:p>
-    <w:bookmarkStart w:id="18" w:name="the-notebook"/>
+    <w:bookmarkStart w:id="19" w:name="the-notebook"/>
     <w:p>
       <w:pPr>
         <w:pStyle w:val="Heading2"/>
@@ -9019,8 +9057,8 @@
         <w:t xml:space="preserve">I tried, in the end, for twenty years.</w:t>
       </w:r>
     </w:p>
-    <w:bookmarkEnd w:id="18"/>
-    <w:bookmarkStart w:id="19" w:name="odd-moments"/>
+    <w:bookmarkEnd w:id="19"/>
+    <w:bookmarkStart w:id="20" w:name="odd-moments"/>
     <w:p>
       <w:pPr>
         <w:pStyle w:val="Heading2"/>
@@ -11335,8 +11373,8 @@
         <w:t xml:space="preserve">I have kept that decision. I am not sure whether it was a vow or a mistake. I know only that it was made out of love, and that love does not always make the wisest decisions, but it makes the ones that last.</w:t>
       </w:r>
     </w:p>
-    <w:bookmarkEnd w:id="19"/>
-    <w:bookmarkStart w:id="20" w:name="the-search"/>
+    <w:bookmarkEnd w:id="20"/>
+    <w:bookmarkStart w:id="21" w:name="the-search"/>
     <w:p>
       <w:pPr>
         <w:pStyle w:val="Heading2"/>
@@ -12186,8 +12224,8 @@
         <w:t xml:space="preserve">on the sheet. I put a star beside it, and a second, and I did not know what they meant.</w:t>
       </w:r>
     </w:p>
-    <w:bookmarkEnd w:id="20"/>
-    <w:bookmarkStart w:id="21" w:name="the-phonetician"/>
+    <w:bookmarkEnd w:id="21"/>
+    <w:bookmarkStart w:id="22" w:name="the-phonetician"/>
     <w:p>
       <w:pPr>
         <w:pStyle w:val="Heading2"/>
@@ -13993,8 +14031,8 @@
         <w:t xml:space="preserve">I was right. There were thirty more. But Mira and Jonas were the first, and they were the ones who stayed.</w:t>
       </w:r>
     </w:p>
-    <w:bookmarkEnd w:id="21"/>
-    <w:bookmarkStart w:id="22" w:name="under-cover"/>
+    <w:bookmarkEnd w:id="22"/>
+    <w:bookmarkStart w:id="23" w:name="under-cover"/>
     <w:p>
       <w:pPr>
         <w:pStyle w:val="Heading2"/>
@@ -15529,8 +15567,8 @@
         <w:t xml:space="preserve">I did not know yet whether it was a promise or a warning. I know now that it was both.</w:t>
       </w:r>
     </w:p>
-    <w:bookmarkEnd w:id="22"/>
-    <w:bookmarkStart w:id="23" w:name="munich"/>
+    <w:bookmarkEnd w:id="23"/>
+    <w:bookmarkStart w:id="24" w:name="munich"/>
     <w:p>
       <w:pPr>
         <w:pStyle w:val="Heading2"/>
@@ -16801,8 +16839,8 @@
         <w:t xml:space="preserve">I have thought many times since that this was my first real mistake. I was not wrong to protect her. But I should have known that a secret kept from one’s friends is a secret that begins to work for someone else.</w:t>
       </w:r>
     </w:p>
-    <w:bookmarkEnd w:id="23"/>
-    <w:bookmarkStart w:id="24" w:name="the-prize"/>
+    <w:bookmarkEnd w:id="24"/>
+    <w:bookmarkStart w:id="25" w:name="the-prize"/>
     <w:p>
       <w:pPr>
         <w:pStyle w:val="Heading2"/>
@@ -18350,8 +18388,8 @@
         <w:t xml:space="preserve">I did it, as I always did. It was the one thing I was sure of.</w:t>
       </w:r>
     </w:p>
-    <w:bookmarkEnd w:id="24"/>
-    <w:bookmarkStart w:id="25" w:name="the-child"/>
+    <w:bookmarkEnd w:id="25"/>
+    <w:bookmarkStart w:id="26" w:name="the-child"/>
     <w:p>
       <w:pPr>
         <w:pStyle w:val="Heading2"/>
@@ -19630,8 +19668,8 @@
         <w:t xml:space="preserve">She fell asleep against me, in the dark. I did not move for a long time. Somewhere below, in the courtyard, someone was singing under their breath, and I listened, as I always do, and I thought that I had finally been given an answer, and that it was not one I could have found by thinking.</w:t>
       </w:r>
     </w:p>
-    <w:bookmarkEnd w:id="25"/>
-    <w:bookmarkStart w:id="26" w:name="restart"/>
+    <w:bookmarkEnd w:id="26"/>
+    <w:bookmarkStart w:id="27" w:name="restart"/>
     <w:p>
       <w:pPr>
         <w:pStyle w:val="Heading2"/>
@@ -21094,8 +21132,8 @@
         <w:t xml:space="preserve">Then I put the pen away, and went to bed, and slept, for the first time in many weeks, without dreaming of a refrigerator.</w:t>
       </w:r>
     </w:p>
-    <w:bookmarkEnd w:id="26"/>
-    <w:bookmarkStart w:id="27" w:name="the-foundation"/>
+    <w:bookmarkEnd w:id="27"/>
+    <w:bookmarkStart w:id="28" w:name="the-foundation"/>
     <w:p>
       <w:pPr>
         <w:pStyle w:val="Heading2"/>
@@ -22441,8 +22479,8 @@
         <w:t xml:space="preserve">I went.</w:t>
       </w:r>
     </w:p>
-    <w:bookmarkEnd w:id="27"/>
-    <w:bookmarkStart w:id="28" w:name="the-cabinet"/>
+    <w:bookmarkEnd w:id="28"/>
+    <w:bookmarkStart w:id="29" w:name="the-cabinet"/>
     <w:p>
       <w:pPr>
         <w:pStyle w:val="Heading2"/>
@@ -24458,8 +24496,8 @@
         <w:t xml:space="preserve">“I’ve been trying to say it for three weeks.”</w:t>
       </w:r>
     </w:p>
-    <w:bookmarkEnd w:id="28"/>
-    <w:bookmarkStart w:id="29" w:name="more-than-enough"/>
+    <w:bookmarkEnd w:id="29"/>
+    <w:bookmarkStart w:id="30" w:name="more-than-enough"/>
     <w:p>
       <w:pPr>
         <w:pStyle w:val="Heading2"/>
@@ -25734,8 +25772,8 @@
         <w:t xml:space="preserve">In the corridor, a cart went by with a rattling wheel. I counted eleven seconds. I did not look round.</w:t>
       </w:r>
     </w:p>
-    <w:bookmarkEnd w:id="29"/>
-    <w:bookmarkStart w:id="30" w:name="four-question-marks"/>
+    <w:bookmarkEnd w:id="30"/>
+    <w:bookmarkStart w:id="31" w:name="four-question-marks"/>
     <w:p>
       <w:pPr>
         <w:pStyle w:val="Heading2"/>
@@ -27612,8 +27650,8 @@
         <w:t xml:space="preserve">It does not scan. It is the best I have done.</w:t>
       </w:r>
     </w:p>
-    <w:bookmarkEnd w:id="30"/>
-    <w:bookmarkStart w:id="31" w:name="the-leak"/>
+    <w:bookmarkEnd w:id="31"/>
+    <w:bookmarkStart w:id="32" w:name="the-leak"/>
     <w:p>
       <w:pPr>
         <w:pStyle w:val="Heading2"/>
@@ -30149,8 +30187,8 @@
         <w:t xml:space="preserve">It was true. That was the worst of it. It was entirely true.</w:t>
       </w:r>
     </w:p>
-    <w:bookmarkEnd w:id="31"/>
-    <w:bookmarkStart w:id="32" w:name="the-draft"/>
+    <w:bookmarkEnd w:id="32"/>
+    <w:bookmarkStart w:id="33" w:name="the-draft"/>
     <w:p>
       <w:pPr>
         <w:pStyle w:val="Heading2"/>
@@ -31882,8 +31920,8 @@
         <w:t xml:space="preserve">On Thursday morning I went to work.</w:t>
       </w:r>
     </w:p>
-    <w:bookmarkEnd w:id="32"/>
-    <w:bookmarkStart w:id="33" w:name="duck-and-rabbit"/>
+    <w:bookmarkEnd w:id="33"/>
+    <w:bookmarkStart w:id="34" w:name="duck-and-rabbit"/>
     <w:p>
       <w:pPr>
         <w:pStyle w:val="Heading2"/>
@@ -33915,8 +33953,8 @@
         <w:t xml:space="preserve">She nodded gravely, as though this were quite ordinary, which, to her, it was. She slid down from my knee and went to find the cake.</w:t>
       </w:r>
     </w:p>
-    <w:bookmarkEnd w:id="33"/>
-    <w:bookmarkStart w:id="34" w:name="the-four-minutes"/>
+    <w:bookmarkEnd w:id="34"/>
+    <w:bookmarkStart w:id="35" w:name="the-four-minutes"/>
     <w:p>
       <w:pPr>
         <w:pStyle w:val="Heading2"/>
@@ -35540,9 +35578,9 @@
         </w:pict>
       </w:r>
     </w:p>
-    <w:bookmarkEnd w:id="34"/>
     <w:bookmarkEnd w:id="35"/>
-    <w:bookmarkStart w:id="53" w:name="appendix-the-science-behind-the-story"/>
+    <w:bookmarkEnd w:id="36"/>
+    <w:bookmarkStart w:id="54" w:name="appendix-the-science-behind-the-story"/>
     <w:p>
       <w:pPr>
         <w:pStyle w:val="Heading1"/>
@@ -35566,7 +35604,7 @@
         <w:t xml:space="preserve">This book is fiction, and its central scientific premise is invented. The rules of inheritance it uses are real. This appendix separates the two.</w:t>
       </w:r>
     </w:p>
-    <w:bookmarkStart w:id="38" w:name="how-inheritance-works"/>
+    <w:bookmarkStart w:id="39" w:name="how-inheritance-works"/>
     <w:p>
       <w:pPr>
         <w:pStyle w:val="Heading2"/>
@@ -35618,7 +35656,7 @@
         </w:rPr>
         <w:t xml:space="preserve"> </w:t>
       </w:r>
-      <w:hyperlink r:id="rId36">
+      <w:hyperlink r:id="rId37">
         <w:r>
           <w:rPr>
             <w:rStyle w:val="Hyperlink"/>
@@ -35663,7 +35701,7 @@
         </w:rPr>
         <w:t xml:space="preserve"> </w:t>
       </w:r>
-      <w:hyperlink r:id="rId37">
+      <w:hyperlink r:id="rId38">
         <w:r>
           <w:rPr>
             <w:rStyle w:val="Hyperlink"/>
@@ -36043,8 +36081,8 @@
         <w:t xml:space="preserve">is unlikely to pass intact to one child, and why the story treats reassembly as a matter of odds.</w:t>
       </w:r>
     </w:p>
-    <w:bookmarkEnd w:id="38"/>
-    <w:bookmarkStart w:id="39" w:name="germline-and-body-cells"/>
+    <w:bookmarkEnd w:id="39"/>
+    <w:bookmarkStart w:id="40" w:name="germline-and-body-cells"/>
     <w:p>
       <w:pPr>
         <w:pStyle w:val="Heading2"/>
@@ -36144,8 +36182,8 @@
         <w:t xml:space="preserve">: some cells carry the change and others do not. It also risks unintended changes elsewhere in the genome. The story passes over these problems, because Stone’s work is secret and the narrator does not describe it.</w:t>
       </w:r>
     </w:p>
-    <w:bookmarkEnd w:id="39"/>
-    <w:bookmarkStart w:id="46" w:name="gene-technology"/>
+    <w:bookmarkEnd w:id="40"/>
+    <w:bookmarkStart w:id="47" w:name="gene-technology"/>
     <w:p>
       <w:pPr>
         <w:pStyle w:val="Heading2"/>
@@ -36173,7 +36211,7 @@
         </w:rPr>
         <w:t xml:space="preserve"> </w:t>
       </w:r>
-      <w:hyperlink r:id="rId40">
+      <w:hyperlink r:id="rId41">
         <w:r>
           <w:rPr>
             <w:rStyle w:val="Hyperlink"/>
@@ -36210,7 +36248,7 @@
         </w:rPr>
         <w:t xml:space="preserve"> </w:t>
       </w:r>
-      <w:hyperlink r:id="rId41">
+      <w:hyperlink r:id="rId42">
         <w:r>
           <w:rPr>
             <w:rStyle w:val="Hyperlink"/>
@@ -36231,7 +36269,7 @@
         </w:rPr>
         <w:t xml:space="preserve"> </w:t>
       </w:r>
-      <w:hyperlink r:id="rId42">
+      <w:hyperlink r:id="rId43">
         <w:r>
           <w:rPr>
             <w:rStyle w:val="Hyperlink"/>
@@ -36252,7 +36290,7 @@
         </w:rPr>
         <w:t xml:space="preserve"> </w:t>
       </w:r>
-      <w:hyperlink r:id="rId43">
+      <w:hyperlink r:id="rId44">
         <w:r>
           <w:rPr>
             <w:rStyle w:val="Hyperlink"/>
@@ -36290,7 +36328,7 @@
         </w:rPr>
         <w:t xml:space="preserve"> </w:t>
       </w:r>
-      <w:hyperlink r:id="rId44">
+      <w:hyperlink r:id="rId45">
         <w:r>
           <w:rPr>
             <w:rStyle w:val="Hyperlink"/>
@@ -36317,7 +36355,7 @@
         </w:rPr>
         <w:t xml:space="preserve"> </w:t>
       </w:r>
-      <w:hyperlink r:id="rId45">
+      <w:hyperlink r:id="rId46">
         <w:r>
           <w:rPr>
             <w:rStyle w:val="Hyperlink"/>
@@ -36339,8 +36377,8 @@
         <w:t xml:space="preserve">first signed in December 2015, and renewed since, bars the Food and Drug Administration from reviewing applications to begin clinical research in which a human embryo is intentionally modified to carry a heritable change. Both facts bear on the book’s setting and its characters’ choice to stay hidden.</w:t>
       </w:r>
     </w:p>
-    <w:bookmarkEnd w:id="46"/>
-    <w:bookmarkStart w:id="48" w:name="intelligence-and-the-cognitive-package"/>
+    <w:bookmarkEnd w:id="47"/>
+    <w:bookmarkStart w:id="49" w:name="intelligence-and-the-cognitive-package"/>
     <w:p>
       <w:pPr>
         <w:pStyle w:val="Heading2"/>
@@ -36412,7 +36450,7 @@
         </w:rPr>
         <w:t xml:space="preserve"> </w:t>
       </w:r>
-      <w:hyperlink r:id="rId47">
+      <w:hyperlink r:id="rId48">
         <w:r>
           <w:rPr>
             <w:rStyle w:val="Hyperlink"/>
@@ -36428,8 +36466,8 @@
         <w:t xml:space="preserve">, but the known variants predict only a modest part of individual differences. There is no known set of dozens of edits that would produce an Einstein.</w:t>
       </w:r>
     </w:p>
-    <w:bookmarkEnd w:id="48"/>
-    <w:bookmarkStart w:id="50" w:name="the-dolphin-package"/>
+    <w:bookmarkEnd w:id="49"/>
+    <w:bookmarkStart w:id="51" w:name="the-dolphin-package"/>
     <w:p>
       <w:pPr>
         <w:pStyle w:val="Heading2"/>
@@ -36457,7 +36495,7 @@
         </w:rPr>
         <w:t xml:space="preserve"> </w:t>
       </w:r>
-      <w:hyperlink r:id="rId49">
+      <w:hyperlink r:id="rId50">
         <w:r>
           <w:rPr>
             <w:rStyle w:val="Hyperlink"/>
@@ -36484,8 +36522,8 @@
         <w:t xml:space="preserve">The book’s claim, that rewritten circuits in a human brain could give echo-resolution and social prediction from partial sounds, is invented. No such edit is known, and the book does not describe one. This is deliberate. It keeps the story about people and consequences, not methods.</w:t>
       </w:r>
     </w:p>
-    <w:bookmarkEnd w:id="50"/>
-    <w:bookmarkStart w:id="51" w:name="detection"/>
+    <w:bookmarkEnd w:id="51"/>
+    <w:bookmarkStart w:id="52" w:name="detection"/>
     <w:p>
       <w:pPr>
         <w:pStyle w:val="Heading2"/>
@@ -36508,8 +36546,8 @@
         <w:t xml:space="preserve">Whole-genome sequencing reads a person’s DNA and compares it to a reference. Stretches that do not match the human reference can stand out, which is the basis of the story’s fear of detection. Consumer ancestry and health tests look at selected positions only, and would not reveal most of what the book describes.</w:t>
       </w:r>
     </w:p>
-    <w:bookmarkEnd w:id="51"/>
-    <w:bookmarkStart w:id="52" w:name="what-is-fact-and-what-is-fiction"/>
+    <w:bookmarkEnd w:id="52"/>
+    <w:bookmarkStart w:id="53" w:name="what-is-fact-and-what-is-fiction"/>
     <w:p>
       <w:pPr>
         <w:pStyle w:val="Heading2"/>
@@ -36843,9 +36881,9 @@
         </w:pict>
       </w:r>
     </w:p>
-    <w:bookmarkEnd w:id="52"/>
     <w:bookmarkEnd w:id="53"/>
-    <w:bookmarkStart w:id="59" w:name="notes-and-further-reading"/>
+    <w:bookmarkEnd w:id="54"/>
+    <w:bookmarkStart w:id="60" w:name="notes-and-further-reading"/>
     <w:p>
       <w:pPr>
         <w:pStyle w:val="Heading1"/>
@@ -36888,7 +36926,7 @@
         </w:rPr>
         <w:t xml:space="preserve"> </w:t>
       </w:r>
-      <w:hyperlink r:id="rId36">
+      <w:hyperlink r:id="rId37">
         <w:r>
           <w:rPr>
             <w:rStyle w:val="Hyperlink"/>
@@ -37037,7 +37075,7 @@
         </w:rPr>
         <w:t xml:space="preserve"> </w:t>
       </w:r>
-      <w:hyperlink r:id="rId54">
+      <w:hyperlink r:id="rId55">
         <w:r>
           <w:rPr>
             <w:rStyle w:val="Hyperlink"/>
@@ -37071,7 +37109,7 @@
         </w:rPr>
         <w:t xml:space="preserve"> </w:t>
       </w:r>
-      <w:hyperlink r:id="rId37">
+      <w:hyperlink r:id="rId38">
         <w:r>
           <w:rPr>
             <w:rStyle w:val="Hyperlink"/>
@@ -37117,7 +37155,7 @@
         </w:rPr>
         <w:t xml:space="preserve"> </w:t>
       </w:r>
-      <w:hyperlink r:id="rId40">
+      <w:hyperlink r:id="rId41">
         <w:r>
           <w:rPr>
             <w:rStyle w:val="Hyperlink"/>
@@ -37164,7 +37202,7 @@
         </w:rPr>
         <w:t xml:space="preserve"> </w:t>
       </w:r>
-      <w:hyperlink r:id="rId41">
+      <w:hyperlink r:id="rId42">
         <w:r>
           <w:rPr>
             <w:rStyle w:val="Hyperlink"/>
@@ -37210,7 +37248,7 @@
         </w:rPr>
         <w:t xml:space="preserve">Liang, P., et al. </w:t>
       </w:r>
-      <w:hyperlink r:id="rId42">
+      <w:hyperlink r:id="rId43">
         <w:r>
           <w:rPr>
             <w:rStyle w:val="Hyperlink"/>
@@ -37270,7 +37308,7 @@
         </w:rPr>
         <w:t xml:space="preserve"> </w:t>
       </w:r>
-      <w:hyperlink r:id="rId43">
+      <w:hyperlink r:id="rId44">
         <w:r>
           <w:rPr>
             <w:rStyle w:val="Hyperlink"/>
@@ -37324,7 +37362,7 @@
         </w:rPr>
         <w:t xml:space="preserve"> </w:t>
       </w:r>
-      <w:hyperlink r:id="rId44">
+      <w:hyperlink r:id="rId45">
         <w:r>
           <w:rPr>
             <w:rStyle w:val="Hyperlink"/>
@@ -37351,7 +37389,7 @@
         </w:rPr>
         <w:t xml:space="preserve"> </w:t>
       </w:r>
-      <w:hyperlink r:id="rId55">
+      <w:hyperlink r:id="rId56">
         <w:r>
           <w:rPr>
             <w:rStyle w:val="Hyperlink"/>
@@ -37378,7 +37416,7 @@
         </w:rPr>
         <w:t xml:space="preserve"> </w:t>
       </w:r>
-      <w:hyperlink r:id="rId45">
+      <w:hyperlink r:id="rId46">
         <w:r>
           <w:rPr>
             <w:rStyle w:val="Hyperlink"/>
@@ -37405,7 +37443,7 @@
         </w:rPr>
         <w:t xml:space="preserve"> </w:t>
       </w:r>
-      <w:hyperlink r:id="rId56">
+      <w:hyperlink r:id="rId57">
         <w:r>
           <w:rPr>
             <w:rStyle w:val="Hyperlink"/>
@@ -37457,7 +37495,7 @@
         </w:rPr>
         <w:t xml:space="preserve"> </w:t>
       </w:r>
-      <w:hyperlink r:id="rId47">
+      <w:hyperlink r:id="rId48">
         <w:r>
           <w:rPr>
             <w:rStyle w:val="Hyperlink"/>
@@ -37529,7 +37567,7 @@
         </w:rPr>
         <w:t xml:space="preserve"> </w:t>
       </w:r>
-      <w:hyperlink r:id="rId49">
+      <w:hyperlink r:id="rId50">
         <w:r>
           <w:rPr>
             <w:rStyle w:val="Hyperlink"/>
@@ -37738,7 +37776,7 @@
         </w:pict>
       </w:r>
     </w:p>
-    <w:bookmarkStart w:id="58" w:name="the-fiction-this-book-keeps-company-with"/>
+    <w:bookmarkStart w:id="59" w:name="the-fiction-this-book-keeps-company-with"/>
     <w:p>
       <w:pPr>
         <w:pStyle w:val="Heading2"/>
@@ -37770,7 +37808,7 @@
         </w:rPr>
         <w:t xml:space="preserve"> </w:t>
       </w:r>
-      <w:hyperlink r:id="rId57">
+      <w:hyperlink r:id="rId58">
         <w:r>
           <w:rPr>
             <w:rStyle w:val="Hyperlink"/>
@@ -38005,9 +38043,9 @@
         </w:pict>
       </w:r>
     </w:p>
-    <w:bookmarkEnd w:id="58"/>
     <w:bookmarkEnd w:id="59"/>
-    <w:bookmarkStart w:id="60" w:name="about-the-author"/>
+    <w:bookmarkEnd w:id="60"/>
+    <w:bookmarkStart w:id="61" w:name="about-the-author"/>
     <w:p>
       <w:pPr>
         <w:pStyle w:val="Heading1"/>
@@ -38028,7 +38066,7 @@
         <w:rPr>
           <w:lang w:val="en-US"/>
         </w:rPr>
-        <w:t xml:space="preserve">Frank Stone is a pseudonym. It is also the name of the fertility doctor in this book, a coincidence the author has chosen not to annotate, in keeping with the doctor’s own methods.</w:t>
+        <w:t xml:space="preserve">Frank N. Stone is a pseudonym. It differs from the name of the fertility doctor in this book by one middle initial, a coincidence the author has chosen not to annotate, in keeping with the doctor’s own methods.</w:t>
       </w:r>
     </w:p>
     <w:p>
@@ -38060,8 +38098,8 @@
         </w:pict>
       </w:r>
     </w:p>
-    <w:bookmarkEnd w:id="60"/>
-    <w:bookmarkStart w:id="61" w:name="also-by-lothar-j.-musiol"/>
+    <w:bookmarkEnd w:id="61"/>
+    <w:bookmarkStart w:id="62" w:name="also-by-lothar-j.-musiol"/>
     <w:p>
       <w:pPr>
         <w:pStyle w:val="Heading1"/>
@@ -38684,7 +38722,7 @@
         <w:t xml:space="preserve">Auswandern – Ab in die USA, Kanada, Australien oder Neuseeland?</w:t>
       </w:r>
     </w:p>
-    <w:bookmarkEnd w:id="61"/>
+    <w:bookmarkEnd w:id="62"/>
     <w:sectPr>
       <w:footnotePr>
         <w:numRestart w:val="eachSect"/>

</xml_diff>

<commit_message>
Forbidden Offspring: complete pen name Frank N. Stone; N. appears on the consent form and notebook flyleaf
Fixes the previous commit, which updated only the byline and manuscript build. Now also EPUB metadata, standing notes and handover; rebuilt docx/EPUB.

Co-Authored-By: Claude Sonnet 5.5 <noreply@anthropic.com>
</commit_message>
<xml_diff>
--- a/Forbidden_Offspring/Forbidden_Offspring_v1.docx
+++ b/Forbidden_Offspring/Forbidden_Offspring_v1.docx
@@ -32,49 +32,12 @@
         <w:rPr>
           <w:lang w:val="en-US"/>
         </w:rPr>
-        <w:t xml:space="preserve">Lothar J. Musiol writing as Frank Stone</w:t>
-      </w:r>
-    </w:p>
-    <w:bookmarkStart w:id="9" w:name="forbidden-offspring"/>
-    <w:p>
-      <w:pPr>
-        <w:pStyle w:val="Heading1"/>
-        <w:pageBreakBefore/>
-      </w:pPr>
-      <w:r>
-        <w:rPr>
-          <w:lang w:val="en-US"/>
-        </w:rPr>
-        <w:t xml:space="preserve">Forbidden Offspring</w:t>
+        <w:t xml:space="preserve">Lothar J. Musiol writing as Frank N. Stone</w:t>
       </w:r>
     </w:p>
     <w:p>
       <w:pPr>
         <w:pStyle w:val="FirstParagraph"/>
-      </w:pPr>
-      <w:r>
-        <w:rPr>
-          <w:i/>
-          <w:iCs/>
-          <w:lang w:val="en-US"/>
-        </w:rPr>
-        <w:t xml:space="preserve">A novel</w:t>
-      </w:r>
-    </w:p>
-    <w:p>
-      <w:pPr>
-        <w:pStyle w:val="BodyText"/>
-      </w:pPr>
-      <w:r>
-        <w:rPr>
-          <w:lang w:val="en-US"/>
-        </w:rPr>
-        <w:t xml:space="preserve">Lothar J. Musiol writing as Frank N. Stone</w:t>
-      </w:r>
-    </w:p>
-    <w:p>
-      <w:pPr>
-        <w:pStyle w:val="BodyText"/>
       </w:pPr>
       <w:r>
         <w:rPr>
@@ -101,8 +64,7 @@
         </w:pict>
       </w:r>
     </w:p>
-    <w:bookmarkEnd w:id="9"/>
-    <w:bookmarkStart w:id="10" w:name="consent"/>
+    <w:bookmarkStart w:id="9" w:name="consent"/>
     <w:p>
       <w:pPr>
         <w:pStyle w:val="Heading1"/>
@@ -242,7 +204,7 @@
           <w:bCs/>
           <w:lang w:val="en-US"/>
         </w:rPr>
-        <w:t xml:space="preserve">Frank Stone, M.D.</w:t>
+        <w:t xml:space="preserve">Frank N. Stone, M.D.</w:t>
       </w:r>
     </w:p>
     <w:p>
@@ -490,8 +452,8 @@
         <w:t xml:space="preserve">none.</w:t>
       </w:r>
     </w:p>
-    <w:bookmarkEnd w:id="10"/>
-    <w:bookmarkStart w:id="18" w:name="part-one-stone"/>
+    <w:bookmarkEnd w:id="9"/>
+    <w:bookmarkStart w:id="17" w:name="part-one-stone"/>
     <w:p>
       <w:pPr>
         <w:pStyle w:val="Heading1"/>
@@ -504,7 +466,7 @@
         <w:t xml:space="preserve">PART ONE: STONE</w:t>
       </w:r>
     </w:p>
-    <w:bookmarkStart w:id="11" w:name="four-minutes"/>
+    <w:bookmarkStart w:id="10" w:name="four-minutes"/>
     <w:p>
       <w:pPr>
         <w:pStyle w:val="Heading2"/>
@@ -1394,8 +1356,8 @@
         <w:t xml:space="preserve">I kept the handshake a good while longer than I needed to.</w:t>
       </w:r>
     </w:p>
-    <w:bookmarkEnd w:id="11"/>
-    <w:bookmarkStart w:id="12" w:name="test-time"/>
+    <w:bookmarkEnd w:id="10"/>
+    <w:bookmarkStart w:id="11" w:name="test-time"/>
     <w:p>
       <w:pPr>
         <w:pStyle w:val="Heading2"/>
@@ -2539,8 +2501,8 @@
         <w:t xml:space="preserve">I have thought since that I was wrong to call her a subject. She was a person who had noticed me. It is a rarer thing than most men think.</w:t>
       </w:r>
     </w:p>
-    <w:bookmarkEnd w:id="12"/>
-    <w:bookmarkStart w:id="13" w:name="the-ledger"/>
+    <w:bookmarkEnd w:id="11"/>
+    <w:bookmarkStart w:id="12" w:name="the-ledger"/>
     <w:p>
       <w:pPr>
         <w:pStyle w:val="Heading2"/>
@@ -3496,8 +3458,8 @@
         <w:t xml:space="preserve">I had been in that room perhaps twice. I had never listened to it.</w:t>
       </w:r>
     </w:p>
-    <w:bookmarkEnd w:id="13"/>
-    <w:bookmarkStart w:id="14" w:name="the-second-listener"/>
+    <w:bookmarkEnd w:id="12"/>
+    <w:bookmarkStart w:id="13" w:name="the-second-listener"/>
     <w:p>
       <w:pPr>
         <w:pStyle w:val="Heading2"/>
@@ -4246,8 +4208,8 @@
         <w:t xml:space="preserve">That was the first night of the account you are reading.</w:t>
       </w:r>
     </w:p>
-    <w:bookmarkEnd w:id="14"/>
-    <w:bookmarkStart w:id="15" w:name="the-apartment"/>
+    <w:bookmarkEnd w:id="13"/>
+    <w:bookmarkStart w:id="14" w:name="the-apartment"/>
     <w:p>
       <w:pPr>
         <w:pStyle w:val="Heading2"/>
@@ -5878,8 +5840,8 @@
         <w:t xml:space="preserve">I do not think he intended it as a joke.</w:t>
       </w:r>
     </w:p>
-    <w:bookmarkEnd w:id="15"/>
-    <w:bookmarkStart w:id="16" w:name="the-bargain"/>
+    <w:bookmarkEnd w:id="14"/>
+    <w:bookmarkStart w:id="15" w:name="the-bargain"/>
     <w:p>
       <w:pPr>
         <w:pStyle w:val="Heading2"/>
@@ -7282,8 +7244,8 @@
         <w:t xml:space="preserve">It was the first time I had ever thought of it as an accident.</w:t>
       </w:r>
     </w:p>
-    <w:bookmarkEnd w:id="16"/>
-    <w:bookmarkStart w:id="17" w:name="the-stroke"/>
+    <w:bookmarkEnd w:id="15"/>
+    <w:bookmarkStart w:id="16" w:name="the-stroke"/>
     <w:p>
       <w:pPr>
         <w:pStyle w:val="Heading2"/>
@@ -8200,9 +8162,9 @@
         <w:t xml:space="preserve">pen</w:t>
       </w:r>
     </w:p>
+    <w:bookmarkEnd w:id="16"/>
     <w:bookmarkEnd w:id="17"/>
-    <w:bookmarkEnd w:id="18"/>
-    <w:bookmarkStart w:id="36" w:name="part-two-the-offspring"/>
+    <w:bookmarkStart w:id="35" w:name="part-two-the-offspring"/>
     <w:p>
       <w:pPr>
         <w:pStyle w:val="Heading1"/>
@@ -8215,7 +8177,7 @@
         <w:t xml:space="preserve">PART TWO: THE OFFSPRING</w:t>
       </w:r>
     </w:p>
-    <w:bookmarkStart w:id="19" w:name="the-notebook"/>
+    <w:bookmarkStart w:id="18" w:name="the-notebook"/>
     <w:p>
       <w:pPr>
         <w:pStyle w:val="Heading2"/>
@@ -8656,6 +8618,69 @@
         <w:rPr>
           <w:lang w:val="en-US"/>
         </w:rPr>
+        <w:t xml:space="preserve">I opened the cover. On the flyleaf, in the square capitals of a man who labels his jars, it said</w:t>
+      </w:r>
+      <w:r>
+        <w:rPr>
+          <w:lang w:val="en-US"/>
+        </w:rPr>
+        <w:t xml:space="preserve"> </w:t>
+      </w:r>
+      <w:r>
+        <w:rPr>
+          <w:b/>
+          <w:bCs/>
+          <w:lang w:val="en-US"/>
+        </w:rPr>
+        <w:t xml:space="preserve">PROPERTY OF FRANK N. STONE, M.D.</w:t>
+      </w:r>
+      <w:r>
+        <w:rPr>
+          <w:lang w:val="en-US"/>
+        </w:rPr>
+        <w:t xml:space="preserve"> </w:t>
+      </w:r>
+      <w:r>
+        <w:rPr>
+          <w:lang w:val="en-US"/>
+        </w:rPr>
+        <w:t xml:space="preserve">Under that:</w:t>
+      </w:r>
+      <w:r>
+        <w:rPr>
+          <w:lang w:val="en-US"/>
+        </w:rPr>
+        <w:t xml:space="preserve"> </w:t>
+      </w:r>
+      <w:r>
+        <w:rPr>
+          <w:b/>
+          <w:bCs/>
+          <w:lang w:val="en-US"/>
+        </w:rPr>
+        <w:t xml:space="preserve">IF FOUND, RETURN TO DR. FRANK N. STONE.</w:t>
+      </w:r>
+      <w:r>
+        <w:rPr>
+          <w:lang w:val="en-US"/>
+        </w:rPr>
+        <w:t xml:space="preserve"> </w:t>
+      </w:r>
+      <w:r>
+        <w:rPr>
+          <w:lang w:val="en-US"/>
+        </w:rPr>
+        <w:t xml:space="preserve">He had considered that the notebook might one day be found by someone other than himself, and had addressed the return to himself anyway. I never learned what the N stood for. Nothing else I read in four years used it. I decided that it stood for the part of him he had not written down.</w:t>
+      </w:r>
+    </w:p>
+    <w:p>
+      <w:pPr>
+        <w:pStyle w:val="BodyText"/>
+      </w:pPr>
+      <w:r>
+        <w:rPr>
+          <w:lang w:val="en-US"/>
+        </w:rPr>
         <w:t xml:space="preserve">I opened it standing up.</w:t>
       </w:r>
     </w:p>
@@ -9057,8 +9082,8 @@
         <w:t xml:space="preserve">I tried, in the end, for twenty years.</w:t>
       </w:r>
     </w:p>
-    <w:bookmarkEnd w:id="19"/>
-    <w:bookmarkStart w:id="20" w:name="odd-moments"/>
+    <w:bookmarkEnd w:id="18"/>
+    <w:bookmarkStart w:id="19" w:name="odd-moments"/>
     <w:p>
       <w:pPr>
         <w:pStyle w:val="Heading2"/>
@@ -11373,8 +11398,8 @@
         <w:t xml:space="preserve">I have kept that decision. I am not sure whether it was a vow or a mistake. I know only that it was made out of love, and that love does not always make the wisest decisions, but it makes the ones that last.</w:t>
       </w:r>
     </w:p>
-    <w:bookmarkEnd w:id="20"/>
-    <w:bookmarkStart w:id="21" w:name="the-search"/>
+    <w:bookmarkEnd w:id="19"/>
+    <w:bookmarkStart w:id="20" w:name="the-search"/>
     <w:p>
       <w:pPr>
         <w:pStyle w:val="Heading2"/>
@@ -12224,8 +12249,8 @@
         <w:t xml:space="preserve">on the sheet. I put a star beside it, and a second, and I did not know what they meant.</w:t>
       </w:r>
     </w:p>
-    <w:bookmarkEnd w:id="21"/>
-    <w:bookmarkStart w:id="22" w:name="the-phonetician"/>
+    <w:bookmarkEnd w:id="20"/>
+    <w:bookmarkStart w:id="21" w:name="the-phonetician"/>
     <w:p>
       <w:pPr>
         <w:pStyle w:val="Heading2"/>
@@ -14031,8 +14056,8 @@
         <w:t xml:space="preserve">I was right. There were thirty more. But Mira and Jonas were the first, and they were the ones who stayed.</w:t>
       </w:r>
     </w:p>
-    <w:bookmarkEnd w:id="22"/>
-    <w:bookmarkStart w:id="23" w:name="under-cover"/>
+    <w:bookmarkEnd w:id="21"/>
+    <w:bookmarkStart w:id="22" w:name="under-cover"/>
     <w:p>
       <w:pPr>
         <w:pStyle w:val="Heading2"/>
@@ -15567,8 +15592,8 @@
         <w:t xml:space="preserve">I did not know yet whether it was a promise or a warning. I know now that it was both.</w:t>
       </w:r>
     </w:p>
-    <w:bookmarkEnd w:id="23"/>
-    <w:bookmarkStart w:id="24" w:name="munich"/>
+    <w:bookmarkEnd w:id="22"/>
+    <w:bookmarkStart w:id="23" w:name="munich"/>
     <w:p>
       <w:pPr>
         <w:pStyle w:val="Heading2"/>
@@ -16839,8 +16864,8 @@
         <w:t xml:space="preserve">I have thought many times since that this was my first real mistake. I was not wrong to protect her. But I should have known that a secret kept from one’s friends is a secret that begins to work for someone else.</w:t>
       </w:r>
     </w:p>
-    <w:bookmarkEnd w:id="24"/>
-    <w:bookmarkStart w:id="25" w:name="the-prize"/>
+    <w:bookmarkEnd w:id="23"/>
+    <w:bookmarkStart w:id="24" w:name="the-prize"/>
     <w:p>
       <w:pPr>
         <w:pStyle w:val="Heading2"/>
@@ -18388,8 +18413,8 @@
         <w:t xml:space="preserve">I did it, as I always did. It was the one thing I was sure of.</w:t>
       </w:r>
     </w:p>
-    <w:bookmarkEnd w:id="25"/>
-    <w:bookmarkStart w:id="26" w:name="the-child"/>
+    <w:bookmarkEnd w:id="24"/>
+    <w:bookmarkStart w:id="25" w:name="the-child"/>
     <w:p>
       <w:pPr>
         <w:pStyle w:val="Heading2"/>
@@ -19668,8 +19693,8 @@
         <w:t xml:space="preserve">She fell asleep against me, in the dark. I did not move for a long time. Somewhere below, in the courtyard, someone was singing under their breath, and I listened, as I always do, and I thought that I had finally been given an answer, and that it was not one I could have found by thinking.</w:t>
       </w:r>
     </w:p>
-    <w:bookmarkEnd w:id="26"/>
-    <w:bookmarkStart w:id="27" w:name="restart"/>
+    <w:bookmarkEnd w:id="25"/>
+    <w:bookmarkStart w:id="26" w:name="restart"/>
     <w:p>
       <w:pPr>
         <w:pStyle w:val="Heading2"/>
@@ -21132,8 +21157,8 @@
         <w:t xml:space="preserve">Then I put the pen away, and went to bed, and slept, for the first time in many weeks, without dreaming of a refrigerator.</w:t>
       </w:r>
     </w:p>
-    <w:bookmarkEnd w:id="27"/>
-    <w:bookmarkStart w:id="28" w:name="the-foundation"/>
+    <w:bookmarkEnd w:id="26"/>
+    <w:bookmarkStart w:id="27" w:name="the-foundation"/>
     <w:p>
       <w:pPr>
         <w:pStyle w:val="Heading2"/>
@@ -22479,8 +22504,8 @@
         <w:t xml:space="preserve">I went.</w:t>
       </w:r>
     </w:p>
-    <w:bookmarkEnd w:id="28"/>
-    <w:bookmarkStart w:id="29" w:name="the-cabinet"/>
+    <w:bookmarkEnd w:id="27"/>
+    <w:bookmarkStart w:id="28" w:name="the-cabinet"/>
     <w:p>
       <w:pPr>
         <w:pStyle w:val="Heading2"/>
@@ -24496,8 +24521,8 @@
         <w:t xml:space="preserve">“I’ve been trying to say it for three weeks.”</w:t>
       </w:r>
     </w:p>
-    <w:bookmarkEnd w:id="29"/>
-    <w:bookmarkStart w:id="30" w:name="more-than-enough"/>
+    <w:bookmarkEnd w:id="28"/>
+    <w:bookmarkStart w:id="29" w:name="more-than-enough"/>
     <w:p>
       <w:pPr>
         <w:pStyle w:val="Heading2"/>
@@ -25772,8 +25797,8 @@
         <w:t xml:space="preserve">In the corridor, a cart went by with a rattling wheel. I counted eleven seconds. I did not look round.</w:t>
       </w:r>
     </w:p>
-    <w:bookmarkEnd w:id="30"/>
-    <w:bookmarkStart w:id="31" w:name="four-question-marks"/>
+    <w:bookmarkEnd w:id="29"/>
+    <w:bookmarkStart w:id="30" w:name="four-question-marks"/>
     <w:p>
       <w:pPr>
         <w:pStyle w:val="Heading2"/>
@@ -27650,8 +27675,8 @@
         <w:t xml:space="preserve">It does not scan. It is the best I have done.</w:t>
       </w:r>
     </w:p>
-    <w:bookmarkEnd w:id="31"/>
-    <w:bookmarkStart w:id="32" w:name="the-leak"/>
+    <w:bookmarkEnd w:id="30"/>
+    <w:bookmarkStart w:id="31" w:name="the-leak"/>
     <w:p>
       <w:pPr>
         <w:pStyle w:val="Heading2"/>
@@ -30187,8 +30212,8 @@
         <w:t xml:space="preserve">It was true. That was the worst of it. It was entirely true.</w:t>
       </w:r>
     </w:p>
-    <w:bookmarkEnd w:id="32"/>
-    <w:bookmarkStart w:id="33" w:name="the-draft"/>
+    <w:bookmarkEnd w:id="31"/>
+    <w:bookmarkStart w:id="32" w:name="the-draft"/>
     <w:p>
       <w:pPr>
         <w:pStyle w:val="Heading2"/>
@@ -31920,8 +31945,8 @@
         <w:t xml:space="preserve">On Thursday morning I went to work.</w:t>
       </w:r>
     </w:p>
-    <w:bookmarkEnd w:id="33"/>
-    <w:bookmarkStart w:id="34" w:name="duck-and-rabbit"/>
+    <w:bookmarkEnd w:id="32"/>
+    <w:bookmarkStart w:id="33" w:name="duck-and-rabbit"/>
     <w:p>
       <w:pPr>
         <w:pStyle w:val="Heading2"/>
@@ -33953,8 +33978,8 @@
         <w:t xml:space="preserve">She nodded gravely, as though this were quite ordinary, which, to her, it was. She slid down from my knee and went to find the cake.</w:t>
       </w:r>
     </w:p>
-    <w:bookmarkEnd w:id="34"/>
-    <w:bookmarkStart w:id="35" w:name="the-four-minutes"/>
+    <w:bookmarkEnd w:id="33"/>
+    <w:bookmarkStart w:id="34" w:name="the-four-minutes"/>
     <w:p>
       <w:pPr>
         <w:pStyle w:val="Heading2"/>
@@ -35578,9 +35603,9 @@
         </w:pict>
       </w:r>
     </w:p>
+    <w:bookmarkEnd w:id="34"/>
     <w:bookmarkEnd w:id="35"/>
-    <w:bookmarkEnd w:id="36"/>
-    <w:bookmarkStart w:id="54" w:name="appendix-the-science-behind-the-story"/>
+    <w:bookmarkStart w:id="53" w:name="appendix-the-science-behind-the-story"/>
     <w:p>
       <w:pPr>
         <w:pStyle w:val="Heading1"/>
@@ -35604,7 +35629,7 @@
         <w:t xml:space="preserve">This book is fiction, and its central scientific premise is invented. The rules of inheritance it uses are real. This appendix separates the two.</w:t>
       </w:r>
     </w:p>
-    <w:bookmarkStart w:id="39" w:name="how-inheritance-works"/>
+    <w:bookmarkStart w:id="38" w:name="how-inheritance-works"/>
     <w:p>
       <w:pPr>
         <w:pStyle w:val="Heading2"/>
@@ -35656,7 +35681,7 @@
         </w:rPr>
         <w:t xml:space="preserve"> </w:t>
       </w:r>
-      <w:hyperlink r:id="rId37">
+      <w:hyperlink r:id="rId36">
         <w:r>
           <w:rPr>
             <w:rStyle w:val="Hyperlink"/>
@@ -35701,7 +35726,7 @@
         </w:rPr>
         <w:t xml:space="preserve"> </w:t>
       </w:r>
-      <w:hyperlink r:id="rId38">
+      <w:hyperlink r:id="rId37">
         <w:r>
           <w:rPr>
             <w:rStyle w:val="Hyperlink"/>
@@ -36081,8 +36106,8 @@
         <w:t xml:space="preserve">is unlikely to pass intact to one child, and why the story treats reassembly as a matter of odds.</w:t>
       </w:r>
     </w:p>
-    <w:bookmarkEnd w:id="39"/>
-    <w:bookmarkStart w:id="40" w:name="germline-and-body-cells"/>
+    <w:bookmarkEnd w:id="38"/>
+    <w:bookmarkStart w:id="39" w:name="germline-and-body-cells"/>
     <w:p>
       <w:pPr>
         <w:pStyle w:val="Heading2"/>
@@ -36182,8 +36207,8 @@
         <w:t xml:space="preserve">: some cells carry the change and others do not. It also risks unintended changes elsewhere in the genome. The story passes over these problems, because Stone’s work is secret and the narrator does not describe it.</w:t>
       </w:r>
     </w:p>
-    <w:bookmarkEnd w:id="40"/>
-    <w:bookmarkStart w:id="47" w:name="gene-technology"/>
+    <w:bookmarkEnd w:id="39"/>
+    <w:bookmarkStart w:id="46" w:name="gene-technology"/>
     <w:p>
       <w:pPr>
         <w:pStyle w:val="Heading2"/>
@@ -36211,7 +36236,7 @@
         </w:rPr>
         <w:t xml:space="preserve"> </w:t>
       </w:r>
-      <w:hyperlink r:id="rId41">
+      <w:hyperlink r:id="rId40">
         <w:r>
           <w:rPr>
             <w:rStyle w:val="Hyperlink"/>
@@ -36248,7 +36273,7 @@
         </w:rPr>
         <w:t xml:space="preserve"> </w:t>
       </w:r>
-      <w:hyperlink r:id="rId42">
+      <w:hyperlink r:id="rId41">
         <w:r>
           <w:rPr>
             <w:rStyle w:val="Hyperlink"/>
@@ -36269,7 +36294,7 @@
         </w:rPr>
         <w:t xml:space="preserve"> </w:t>
       </w:r>
-      <w:hyperlink r:id="rId43">
+      <w:hyperlink r:id="rId42">
         <w:r>
           <w:rPr>
             <w:rStyle w:val="Hyperlink"/>
@@ -36290,7 +36315,7 @@
         </w:rPr>
         <w:t xml:space="preserve"> </w:t>
       </w:r>
-      <w:hyperlink r:id="rId44">
+      <w:hyperlink r:id="rId43">
         <w:r>
           <w:rPr>
             <w:rStyle w:val="Hyperlink"/>
@@ -36328,7 +36353,7 @@
         </w:rPr>
         <w:t xml:space="preserve"> </w:t>
       </w:r>
-      <w:hyperlink r:id="rId45">
+      <w:hyperlink r:id="rId44">
         <w:r>
           <w:rPr>
             <w:rStyle w:val="Hyperlink"/>
@@ -36355,7 +36380,7 @@
         </w:rPr>
         <w:t xml:space="preserve"> </w:t>
       </w:r>
-      <w:hyperlink r:id="rId46">
+      <w:hyperlink r:id="rId45">
         <w:r>
           <w:rPr>
             <w:rStyle w:val="Hyperlink"/>
@@ -36377,8 +36402,8 @@
         <w:t xml:space="preserve">first signed in December 2015, and renewed since, bars the Food and Drug Administration from reviewing applications to begin clinical research in which a human embryo is intentionally modified to carry a heritable change. Both facts bear on the book’s setting and its characters’ choice to stay hidden.</w:t>
       </w:r>
     </w:p>
-    <w:bookmarkEnd w:id="47"/>
-    <w:bookmarkStart w:id="49" w:name="intelligence-and-the-cognitive-package"/>
+    <w:bookmarkEnd w:id="46"/>
+    <w:bookmarkStart w:id="48" w:name="intelligence-and-the-cognitive-package"/>
     <w:p>
       <w:pPr>
         <w:pStyle w:val="Heading2"/>
@@ -36450,7 +36475,7 @@
         </w:rPr>
         <w:t xml:space="preserve"> </w:t>
       </w:r>
-      <w:hyperlink r:id="rId48">
+      <w:hyperlink r:id="rId47">
         <w:r>
           <w:rPr>
             <w:rStyle w:val="Hyperlink"/>
@@ -36466,8 +36491,8 @@
         <w:t xml:space="preserve">, but the known variants predict only a modest part of individual differences. There is no known set of dozens of edits that would produce an Einstein.</w:t>
       </w:r>
     </w:p>
-    <w:bookmarkEnd w:id="49"/>
-    <w:bookmarkStart w:id="51" w:name="the-dolphin-package"/>
+    <w:bookmarkEnd w:id="48"/>
+    <w:bookmarkStart w:id="50" w:name="the-dolphin-package"/>
     <w:p>
       <w:pPr>
         <w:pStyle w:val="Heading2"/>
@@ -36495,7 +36520,7 @@
         </w:rPr>
         <w:t xml:space="preserve"> </w:t>
       </w:r>
-      <w:hyperlink r:id="rId50">
+      <w:hyperlink r:id="rId49">
         <w:r>
           <w:rPr>
             <w:rStyle w:val="Hyperlink"/>
@@ -36522,32 +36547,32 @@
         <w:t xml:space="preserve">The book’s claim, that rewritten circuits in a human brain could give echo-resolution and social prediction from partial sounds, is invented. No such edit is known, and the book does not describe one. This is deliberate. It keeps the story about people and consequences, not methods.</w:t>
       </w:r>
     </w:p>
+    <w:bookmarkEnd w:id="50"/>
+    <w:bookmarkStart w:id="51" w:name="detection"/>
+    <w:p>
+      <w:pPr>
+        <w:pStyle w:val="Heading2"/>
+      </w:pPr>
+      <w:r>
+        <w:rPr>
+          <w:lang w:val="en-US"/>
+        </w:rPr>
+        <w:t xml:space="preserve">6. Detection</w:t>
+      </w:r>
+    </w:p>
+    <w:p>
+      <w:pPr>
+        <w:pStyle w:val="FirstParagraph"/>
+      </w:pPr>
+      <w:r>
+        <w:rPr>
+          <w:lang w:val="en-US"/>
+        </w:rPr>
+        <w:t xml:space="preserve">Whole-genome sequencing reads a person’s DNA and compares it to a reference. Stretches that do not match the human reference can stand out, which is the basis of the story’s fear of detection. Consumer ancestry and health tests look at selected positions only, and would not reveal most of what the book describes.</w:t>
+      </w:r>
+    </w:p>
     <w:bookmarkEnd w:id="51"/>
-    <w:bookmarkStart w:id="52" w:name="detection"/>
-    <w:p>
-      <w:pPr>
-        <w:pStyle w:val="Heading2"/>
-      </w:pPr>
-      <w:r>
-        <w:rPr>
-          <w:lang w:val="en-US"/>
-        </w:rPr>
-        <w:t xml:space="preserve">6. Detection</w:t>
-      </w:r>
-    </w:p>
-    <w:p>
-      <w:pPr>
-        <w:pStyle w:val="FirstParagraph"/>
-      </w:pPr>
-      <w:r>
-        <w:rPr>
-          <w:lang w:val="en-US"/>
-        </w:rPr>
-        <w:t xml:space="preserve">Whole-genome sequencing reads a person’s DNA and compares it to a reference. Stretches that do not match the human reference can stand out, which is the basis of the story’s fear of detection. Consumer ancestry and health tests look at selected positions only, and would not reveal most of what the book describes.</w:t>
-      </w:r>
-    </w:p>
-    <w:bookmarkEnd w:id="52"/>
-    <w:bookmarkStart w:id="53" w:name="what-is-fact-and-what-is-fiction"/>
+    <w:bookmarkStart w:id="52" w:name="what-is-fact-and-what-is-fiction"/>
     <w:p>
       <w:pPr>
         <w:pStyle w:val="Heading2"/>
@@ -36881,9 +36906,9 @@
         </w:pict>
       </w:r>
     </w:p>
+    <w:bookmarkEnd w:id="52"/>
     <w:bookmarkEnd w:id="53"/>
-    <w:bookmarkEnd w:id="54"/>
-    <w:bookmarkStart w:id="60" w:name="notes-and-further-reading"/>
+    <w:bookmarkStart w:id="59" w:name="notes-and-further-reading"/>
     <w:p>
       <w:pPr>
         <w:pStyle w:val="Heading1"/>
@@ -36926,7 +36951,7 @@
         </w:rPr>
         <w:t xml:space="preserve"> </w:t>
       </w:r>
-      <w:hyperlink r:id="rId37">
+      <w:hyperlink r:id="rId36">
         <w:r>
           <w:rPr>
             <w:rStyle w:val="Hyperlink"/>
@@ -37075,7 +37100,7 @@
         </w:rPr>
         <w:t xml:space="preserve"> </w:t>
       </w:r>
-      <w:hyperlink r:id="rId55">
+      <w:hyperlink r:id="rId54">
         <w:r>
           <w:rPr>
             <w:rStyle w:val="Hyperlink"/>
@@ -37109,7 +37134,7 @@
         </w:rPr>
         <w:t xml:space="preserve"> </w:t>
       </w:r>
-      <w:hyperlink r:id="rId38">
+      <w:hyperlink r:id="rId37">
         <w:r>
           <w:rPr>
             <w:rStyle w:val="Hyperlink"/>
@@ -37155,7 +37180,7 @@
         </w:rPr>
         <w:t xml:space="preserve"> </w:t>
       </w:r>
-      <w:hyperlink r:id="rId41">
+      <w:hyperlink r:id="rId40">
         <w:r>
           <w:rPr>
             <w:rStyle w:val="Hyperlink"/>
@@ -37202,7 +37227,7 @@
         </w:rPr>
         <w:t xml:space="preserve"> </w:t>
       </w:r>
-      <w:hyperlink r:id="rId42">
+      <w:hyperlink r:id="rId41">
         <w:r>
           <w:rPr>
             <w:rStyle w:val="Hyperlink"/>
@@ -37248,7 +37273,7 @@
         </w:rPr>
         <w:t xml:space="preserve">Liang, P., et al. </w:t>
       </w:r>
-      <w:hyperlink r:id="rId43">
+      <w:hyperlink r:id="rId42">
         <w:r>
           <w:rPr>
             <w:rStyle w:val="Hyperlink"/>
@@ -37308,7 +37333,7 @@
         </w:rPr>
         <w:t xml:space="preserve"> </w:t>
       </w:r>
-      <w:hyperlink r:id="rId44">
+      <w:hyperlink r:id="rId43">
         <w:r>
           <w:rPr>
             <w:rStyle w:val="Hyperlink"/>
@@ -37362,7 +37387,7 @@
         </w:rPr>
         <w:t xml:space="preserve"> </w:t>
       </w:r>
-      <w:hyperlink r:id="rId45">
+      <w:hyperlink r:id="rId44">
         <w:r>
           <w:rPr>
             <w:rStyle w:val="Hyperlink"/>
@@ -37389,7 +37414,7 @@
         </w:rPr>
         <w:t xml:space="preserve"> </w:t>
       </w:r>
-      <w:hyperlink r:id="rId56">
+      <w:hyperlink r:id="rId55">
         <w:r>
           <w:rPr>
             <w:rStyle w:val="Hyperlink"/>
@@ -37416,7 +37441,7 @@
         </w:rPr>
         <w:t xml:space="preserve"> </w:t>
       </w:r>
-      <w:hyperlink r:id="rId46">
+      <w:hyperlink r:id="rId45">
         <w:r>
           <w:rPr>
             <w:rStyle w:val="Hyperlink"/>
@@ -37443,7 +37468,7 @@
         </w:rPr>
         <w:t xml:space="preserve"> </w:t>
       </w:r>
-      <w:hyperlink r:id="rId57">
+      <w:hyperlink r:id="rId56">
         <w:r>
           <w:rPr>
             <w:rStyle w:val="Hyperlink"/>
@@ -37495,7 +37520,7 @@
         </w:rPr>
         <w:t xml:space="preserve"> </w:t>
       </w:r>
-      <w:hyperlink r:id="rId48">
+      <w:hyperlink r:id="rId47">
         <w:r>
           <w:rPr>
             <w:rStyle w:val="Hyperlink"/>
@@ -37567,7 +37592,7 @@
         </w:rPr>
         <w:t xml:space="preserve"> </w:t>
       </w:r>
-      <w:hyperlink r:id="rId50">
+      <w:hyperlink r:id="rId49">
         <w:r>
           <w:rPr>
             <w:rStyle w:val="Hyperlink"/>
@@ -37776,7 +37801,7 @@
         </w:pict>
       </w:r>
     </w:p>
-    <w:bookmarkStart w:id="59" w:name="the-fiction-this-book-keeps-company-with"/>
+    <w:bookmarkStart w:id="58" w:name="the-fiction-this-book-keeps-company-with"/>
     <w:p>
       <w:pPr>
         <w:pStyle w:val="Heading2"/>
@@ -37808,7 +37833,7 @@
         </w:rPr>
         <w:t xml:space="preserve"> </w:t>
       </w:r>
-      <w:hyperlink r:id="rId58">
+      <w:hyperlink r:id="rId57">
         <w:r>
           <w:rPr>
             <w:rStyle w:val="Hyperlink"/>
@@ -38043,9 +38068,9 @@
         </w:pict>
       </w:r>
     </w:p>
+    <w:bookmarkEnd w:id="58"/>
     <w:bookmarkEnd w:id="59"/>
-    <w:bookmarkEnd w:id="60"/>
-    <w:bookmarkStart w:id="61" w:name="about-the-author"/>
+    <w:bookmarkStart w:id="60" w:name="about-the-author"/>
     <w:p>
       <w:pPr>
         <w:pStyle w:val="Heading1"/>
@@ -38066,7 +38091,7 @@
         <w:rPr>
           <w:lang w:val="en-US"/>
         </w:rPr>
-        <w:t xml:space="preserve">Frank N. Stone is a pseudonym. It differs from the name of the fertility doctor in this book by one middle initial, a coincidence the author has chosen not to annotate, in keeping with the doctor’s own methods.</w:t>
+        <w:t xml:space="preserve">Frank N. Stone is a pseudonym. It is also the name on the fertility doctor’s paperwork in this book, a coincidence the author has chosen not to annotate, in keeping with the doctor’s own methods.</w:t>
       </w:r>
     </w:p>
     <w:p>
@@ -38098,8 +38123,8 @@
         </w:pict>
       </w:r>
     </w:p>
-    <w:bookmarkEnd w:id="61"/>
-    <w:bookmarkStart w:id="62" w:name="also-by-lothar-j.-musiol"/>
+    <w:bookmarkEnd w:id="60"/>
+    <w:bookmarkStart w:id="61" w:name="also-by-lothar-j.-musiol"/>
     <w:p>
       <w:pPr>
         <w:pStyle w:val="Heading1"/>
@@ -38722,7 +38747,7 @@
         <w:t xml:space="preserve">Auswandern – Ab in die USA, Kanada, Australien oder Neuseeland?</w:t>
       </w:r>
     </w:p>
-    <w:bookmarkEnd w:id="62"/>
+    <w:bookmarkEnd w:id="61"/>
     <w:sectPr>
       <w:footnotePr>
         <w:numRestart w:val="eachSect"/>

</xml_diff>

<commit_message>
Forbidden Offspring: author is Genevieve Crisp (not the scientist); Frank N. Stone stays on the scientist's paperwork
Byline 'Lothar J. Musiol writing as Genevieve Crisp', pen-name paragraph, EPUB contributor, standing notes and handover updated; ch. 8 flyleaf hints at the N without naming the joke. Rebuilt docx/EPUB.

Co-Authored-By: Claude Sonnet 5.5 <noreply@anthropic.com>
</commit_message>
<xml_diff>
--- a/Forbidden_Offspring/Forbidden_Offspring_v1.docx
+++ b/Forbidden_Offspring/Forbidden_Offspring_v1.docx
@@ -32,7 +32,7 @@
         <w:rPr>
           <w:lang w:val="en-US"/>
         </w:rPr>
-        <w:t xml:space="preserve">Lothar J. Musiol writing as Frank N. Stone</w:t>
+        <w:t xml:space="preserve">Lothar J. Musiol writing as Genevieve Crisp</w:t>
       </w:r>
     </w:p>
     <w:p>
@@ -8670,7 +8670,7 @@
         <w:rPr>
           <w:lang w:val="en-US"/>
         </w:rPr>
-        <w:t xml:space="preserve">He had considered that the notebook might one day be found by someone other than himself, and had addressed the return to himself anyway. I never learned what the N stood for. Nothing else I read in four years used it. I decided that it stood for the part of him he had not written down.</w:t>
+        <w:t xml:space="preserve">He had considered that the notebook might one day be found by someone other than himself, and had addressed the return to himself anyway. I never learned what the N stood for. Nothing else I read in four years used it. Said quickly, with the N run in, it sounded like the name of a different and more famous doctor, and I decided not to say it aloud.</w:t>
       </w:r>
     </w:p>
     <w:p>
@@ -38091,7 +38091,7 @@
         <w:rPr>
           <w:lang w:val="en-US"/>
         </w:rPr>
-        <w:t xml:space="preserve">Frank N. Stone is a pseudonym. It is also the name on the fertility doctor’s paperwork in this book, a coincidence the author has chosen not to annotate, in keeping with the doctor’s own methods.</w:t>
+        <w:t xml:space="preserve">Genevieve Crisp is a pseudonym. She takes full responsibility for the four minutes.</w:t>
       </w:r>
     </w:p>
     <w:p>

</xml_diff>

<commit_message>
Forbidden Offspring: full read-through, continuity and tic fixes, cover, strict re-score (8.7)
About 15 timeline slips fixed (Wren's birth, Stone's ages, Lena's birth time, leak moved to autumn 2035, Julian's birthday, years in the Julian chapters), 28 narrator tics cut, closing lines for Tobias, Maren and Theo, appendix sub-heads un-numbered, Americanisms fixed. Adds a typographic cover (make_cover.py) embedded in the EPUB, rebuilt docx/EPUB, review, SCORES row and handover status.

Co-Authored-By: Claude Sonnet 5.5 <noreply@anthropic.com>
</commit_message>
<xml_diff>
--- a/Forbidden_Offspring/Forbidden_Offspring_v1.docx
+++ b/Forbidden_Offspring/Forbidden_Offspring_v1.docx
@@ -982,7 +982,7 @@
         <w:rPr>
           <w:lang w:val="en-US"/>
         </w:rPr>
-        <w:t xml:space="preserve">I told them it was a good embryo. That was true. I told them it had been corrected for the condition they feared, a rare error that had taken Ray’s brother at seven. That was also true. I told them nothing else, and I want to be plain about what that cost me, because the answer is that it cost me nothing. I felt nothing. I had expected to. A man is supposed to flinch.</w:t>
+        <w:t xml:space="preserve">I told them it was a good embryo. That was true. I told them it had been corrected for the condition they feared, a rare error that had taken Ray’s brother at seven. That was also true. I told them nothing else, and it cost me nothing. I felt nothing. I had expected to. A man is supposed to flinch.</w:t>
       </w:r>
     </w:p>
     <w:p>
@@ -1319,7 +1319,7 @@
         <w:rPr>
           <w:lang w:val="en-US"/>
         </w:rPr>
-        <w:t xml:space="preserve">It was not fear of being caught. I want that understood. It was a plain animal fear, like discovering that the dog you left in the house has learned to open the door.</w:t>
+        <w:t xml:space="preserve">It was not fear of being caught. It was a plain animal fear, like discovering that the dog you left in the house has learned to open the door.</w:t>
       </w:r>
     </w:p>
     <w:p>
@@ -1500,7 +1500,7 @@
         <w:rPr>
           <w:lang w:val="en-US"/>
         </w:rPr>
-        <w:t xml:space="preserve">I have said that the clinic’s director was a competent and courteous woman. I should say something more, since she is going to matter. I will call her R., because she has asked me never to use her name, and because, more than any person in my life, she deserved to be protected from it.</w:t>
+        <w:t xml:space="preserve">The clinic’s director was a competent and courteous woman, and she is going to matter. I will call her R., because she has asked me never to use her name, and because, more than any person in my life, she deserved to be protected from it.</w:t>
       </w:r>
     </w:p>
     <w:p>
@@ -2055,7 +2055,7 @@
         <w:rPr>
           <w:lang w:val="en-US"/>
         </w:rPr>
-        <w:t xml:space="preserve">I will not say what I did. I have said I will not. I will say that it was quiet, and that my hands were steady, and that at some point, in the middle of it, I became aware that I was humming. It was a tune my mother used to sing, a nursery thing about a lamb that I had not remembered in fifty years. I stopped. I started again. I finished what I was doing, and put it back, and closed the door.</w:t>
+        <w:t xml:space="preserve">I will not say what I did. I have said I will not. It was quiet, my hands were steady, and at some point, in the middle of it, I became aware that I was humming. It was a tune my mother used to sing, a nursery thing about a lamb that I had not remembered in fifty years. I stopped. I started again. I finished what I was doing, and put it back, and closed the door.</w:t>
       </w:r>
     </w:p>
     <w:p>
@@ -2088,7 +2088,7 @@
         <w:rPr>
           <w:lang w:val="en-US"/>
         </w:rPr>
-        <w:t xml:space="preserve">I want to be exact about this. It was not the happiness of a man who has done good, or even of one who has done well. It was a smaller, stranger, more private thing: the simple happiness of someone who has found the one room in the world in which he is entirely himself. I sat down on the stool and put my head in my hands and stayed there, with my coat on its hook and the light over the bench, for what must have been an hour.</w:t>
+        <w:t xml:space="preserve">It was not the happiness of a man who has done good, or even of one who has done well. It was a smaller, stranger, more private thing: the simple happiness of someone who has found the one room in the world in which he is entirely himself. I sat down on the stool and put my head in my hands and stayed there, with my coat on its hook and the light over the bench, for what must have been an hour.</w:t>
       </w:r>
     </w:p>
     <w:p>
@@ -2957,7 +2957,7 @@
         <w:rPr>
           <w:lang w:val="en-US"/>
         </w:rPr>
-        <w:t xml:space="preserve">There were never many. I will say that in my defense, if a defense is wanted. Over eleven years, in four hours a week, on one old incubator, I made fewer than sixty people. Some of those I never saw again after the transfer. Some I saw once, at a distance, in a park or a school corridor, and went home pleased and ashamed. The ones I tracked I tracked from outside, through the same public tables and school newsletters that had given me Danny Pruitt, and the notes that follow are what those sources gave me, and what I could not help noticing.</w:t>
+        <w:t xml:space="preserve">There were never many. I say that in my defense, if a defense is wanted. Over eleven years, in four hours a week, on one old incubator, I made fewer than sixty people. Some of those I never saw again after the transfer. Some I saw once, at a distance, in a park or a school corridor, and went home pleased and ashamed. The ones I tracked I tracked from outside, through the same public tables and school newsletters that had given me Danny Pruitt, and the notes that follow are what those sources gave me, and what I could not help noticing.</w:t>
       </w:r>
     </w:p>
     <w:p>
@@ -3306,7 +3306,7 @@
         <w:rPr>
           <w:lang w:val="en-US"/>
         </w:rPr>
-        <w:t xml:space="preserve">I want to be careful about this, because I have been tempted since to tell a different story. I did not make Julian what he became. I have checked, with the only tools I have left, and the answer is that nothing I did could have produced it, because what he turned into is a thing that happens to a small fraction of all children at random, in every place and age, and that I had not designed and could not have prevented. It was bad luck. I want that written down, in my own hand, in case someone later wishes it to have been me.</w:t>
+        <w:t xml:space="preserve">I have been tempted since to tell a different story. I did not make Julian what he became. I have checked, with the only tools I have left, and the answer is that nothing I did could have produced it, because what he turned into is a thing that happens to a small fraction of all children at random, in every place and age, and that I had not designed and could not have prevented. It was bad luck. I want that written down, in my own hand, in case someone later wishes it to have been me.</w:t>
       </w:r>
     </w:p>
     <w:p>
@@ -3422,7 +3422,7 @@
         <w:rPr>
           <w:lang w:val="en-US"/>
         </w:rPr>
-        <w:t xml:space="preserve">It was a comfort. I will say that. I do not think a man can understand how deep a comfort until he has had one, and the shape of it was a small gray door in a plain room and a dial that turned, and the sense that behind it, perfectly preserved, lay all of the reasons for my life.</w:t>
+        <w:t xml:space="preserve">It was a comfort. I do not think a man can understand how deep a comfort until he has had one, and the shape of it was a small gray door in a plain room and a dial that turned, and the sense that behind it, perfectly preserved, lay all of the reasons for my life.</w:t>
       </w:r>
     </w:p>
     <w:p>
@@ -3546,7 +3546,7 @@
         <w:rPr>
           <w:lang w:val="en-US"/>
         </w:rPr>
-        <w:t xml:space="preserve">I want to be accurate about what I felt. I did not feel triumph. A man who has been told for eleven years that his life’s secret work is a delusion would have felt triumph, and I did not, because it was not a delusion, and the only thing that is worse than being told you are wrong is being proved right at the edge of a swimming pool with nobody to tell.</w:t>
+        <w:t xml:space="preserve">I did not feel triumph. A man who has been told for eleven years that his life’s secret work is a delusion would have felt triumph, and I did not, because it was not a delusion, and the only thing that is worse than being told you are wrong is being proved right at the edge of a swimming pool with nobody to tell.</w:t>
       </w:r>
     </w:p>
     <w:p>
@@ -3667,7 +3667,7 @@
         <w:rPr>
           <w:lang w:val="en-US"/>
         </w:rPr>
-        <w:t xml:space="preserve">I did not follow her. I want that understood, because a man in my position might be expected to. I had given up following the first month. What I did was subscribe, in the name of the clinic, to the quarterly bulletin of the school district, and to the county library’s newsletter, and to a small magazine for parents that listed prizes. There is a great deal to be learned from prize lists. They are the only public record in the country of what children can do.</w:t>
+        <w:t xml:space="preserve">I did not follow her, though a man in my position might be expected to. I had given up following the first month. What I did was subscribe, in the name of the clinic, to the quarterly bulletin of the school district, and to the county library’s newsletter, and to a small magazine for parents that listed prizes. There is a great deal to be learned from prize lists. They are the only public record in the country of what children can do.</w:t>
       </w:r>
     </w:p>
     <w:p>
@@ -4029,7 +4029,7 @@
         <w:rPr>
           <w:lang w:val="en-US"/>
         </w:rPr>
-        <w:t xml:space="preserve">I want to be careful about how I explain what I understood in that kitchen, because I understood several things at once, and not in order.</w:t>
+        <w:t xml:space="preserve">I understood several things in that kitchen at once, and not in order.</w:t>
       </w:r>
     </w:p>
     <w:p>
@@ -5018,7 +5018,7 @@
         <w:rPr>
           <w:lang w:val="en-US"/>
         </w:rPr>
-        <w:t xml:space="preserve">The note had come on a Monday. I have said that I should have stopped there. What I did not say was that I read it standing in the hall, in my coat, and the first thing I felt was not fear. It was something much closer to relief, the plain physical relief of a man who has carried a case for eleven years and has at last been told where to put it down.</w:t>
+        <w:t xml:space="preserve">I read the note standing in the hall, in my coat, and the first thing I felt was not fear. It was something much closer to relief, the plain physical relief of a man who has carried a case for eleven years and has at last been told where to put it down.</w:t>
       </w:r>
     </w:p>
     <w:p>
@@ -5329,7 +5329,7 @@
         <w:rPr>
           <w:lang w:val="en-US"/>
         </w:rPr>
-        <w:t xml:space="preserve">He was eleven that autumn. I want to say that he looked like any child of that age, and he did. He had a gray sweater with a hole at one cuff and he held a book he was not reading, and he stood to one side of the doorway at an angle that I understood later was geometry. He was keeping me where the room would tell him what I did.</w:t>
+        <w:t xml:space="preserve">He was eleven that autumn. He looked like any child of that age. He had a gray sweater with a hole at one cuff and he held a book he was not reading, and he stood to one side of the doorway at an angle that I understood later was geometry. He was keeping me where the room would tell him what I did.</w:t>
       </w:r>
     </w:p>
     <w:p>
@@ -5545,7 +5545,7 @@
         <w:rPr>
           <w:lang w:val="en-US"/>
         </w:rPr>
-        <w:t xml:space="preserve">I want to be exact here, because later I would be asked, by people with power, how long I had known. The answer is that I knew in that moment. Not before. I had locked the indexed notes in a place I considered a vault, and in nine seconds a child told me, without raising his voice, that the vault had been a courtesy.</w:t>
+        <w:t xml:space="preserve">Later I would be asked, by people with power, how long I had known. The answer is that I knew in that moment. Not before. I had locked the indexed notes in a place I considered a vault, and in nine seconds a child told me, without raising his voice, that the vault had been a courtesy.</w:t>
       </w:r>
     </w:p>
     <w:p>
@@ -5717,7 +5717,7 @@
         <w:rPr>
           <w:lang w:val="en-US"/>
         </w:rPr>
-        <w:t xml:space="preserve">I will not describe what I felt. I will say that I had told myself for eleven years that a locked room was a private room, and that the only person who had ever shared my handwriting was a boy of eleven in a gray sweater.</w:t>
+        <w:t xml:space="preserve">I will not describe what I felt. I had told myself for eleven years that a locked room was a private room, and the only person who had ever shared my handwriting was a boy of eleven in a gray sweater.</w:t>
       </w:r>
     </w:p>
     <w:p>
@@ -6037,7 +6037,7 @@
         <w:rPr>
           <w:lang w:val="en-US"/>
         </w:rPr>
-        <w:t xml:space="preserve">I want to be honest about what I felt, since it was not what I had prepared for. I felt, to my surprise, the thing I feel in front of a good student.</w:t>
+        <w:t xml:space="preserve">It was not what I had prepared for. I felt, to my surprise, the thing I feel in front of a good student.</w:t>
       </w:r>
     </w:p>
     <w:p>
@@ -7310,7 +7310,7 @@
         <w:rPr>
           <w:lang w:val="en-US"/>
         </w:rPr>
-        <w:t xml:space="preserve">It had held. I looked at the sheet for a long time. I did not feel guilt. I want to be honest: I felt something I can only describe as tenderness, of the kind a man feels for a thing he has made and has not yet met.</w:t>
+        <w:t xml:space="preserve">It had held. I looked at the sheet for a long time. I did not feel guilt. I felt something I can only describe as tenderness, of the kind a man feels for a thing he has made and has not yet met.</w:t>
       </w:r>
     </w:p>
     <w:p>
@@ -8220,7 +8220,7 @@
         <w:rPr>
           <w:lang w:val="en-US"/>
         </w:rPr>
-        <w:t xml:space="preserve">I was sixteen when I found it, and I want to say at once that I was not looking for it.</w:t>
+        <w:t xml:space="preserve">I was sixteen when I found it, and I was not looking for it.</w:t>
       </w:r>
     </w:p>
     <w:p>
@@ -8903,7 +8903,7 @@
         <w:rPr>
           <w:lang w:val="en-US"/>
         </w:rPr>
-        <w:t xml:space="preserve">I did not take the notebook. I want to be clear. It was his, and it was not mine to carry off in a bag. I took a hundred and twelve photographs of it with my telephone, standing in the corridor, page by page, and I put it back in the drawer under the cardigan, and I closed the drawer, and I said goodbye to him.</w:t>
+        <w:t xml:space="preserve">I did not take the notebook. It was his, and it was not mine to carry off in a bag. I took a hundred and twelve photographs of it with my telephone, standing in the corridor, page by page, and I put it back in the drawer under the cardigan, and I closed the drawer, and I said goodbye to him.</w:t>
       </w:r>
     </w:p>
     <w:p>
@@ -10004,7 +10004,7 @@
         <w:rPr>
           <w:lang w:val="en-US"/>
         </w:rPr>
-        <w:t xml:space="preserve">I want to be fair to myself. It was a hundred and forty. It was a pulse like a drum solo, and it went with a small dry swallow and a quarter-second hesitation before</w:t>
+        <w:t xml:space="preserve">In my defense, it was a hundred and forty. It was a pulse like a drum solo, and it went with a small dry swallow and a quarter-second hesitation before</w:t>
       </w:r>
       <w:r>
         <w:rPr>
@@ -11549,7 +11549,7 @@
         <w:rPr>
           <w:lang w:val="en-US"/>
         </w:rPr>
-        <w:t xml:space="preserve">I became a connoisseur of that word.</w:t>
+        <w:t xml:space="preserve">I became a connoisseur of that word. It means a child who has been noticed by a newspaper with nothing else to print.</w:t>
       </w:r>
     </w:p>
     <w:p>
@@ -11596,7 +11596,7 @@
         <w:rPr>
           <w:lang w:val="en-US"/>
         </w:rPr>
-        <w:t xml:space="preserve">I have said that people with the package reveal themselves in a hundred small ways, if one knows how to listen. A pause before a loud noise. A glance at a door before it opens. A way of leaving a room, a half-second before an argument begins in the next one. Children do it more than adults, because adults have learned to cover it. I sat in a good many parks. I stood at the edge of a good many playgrounds, a tall kid of eighteen with a notebook and an apologetic face, listening. I was twice asked by a parent whether I was lost. I said that I was waiting for a friend.</w:t>
+        <w:t xml:space="preserve">I have said that people with the package reveal themselves in a hundred small ways, if one knows how to listen. A pause before a loud noise. A glance at a door before it opens. A way of leaving a room, a half-second before an argument begins in the next one. Children do it more than adults, because adults have learned to cover it. I sat in a good many parks. I stood at the edge of a good many playgrounds, a tall kid of eighteen with a notebook and an apologetic face, listening. I was twice asked by a parent whether I was lost. I said that I was waiting for a friend. Nobody asked which friend, which says something about parents, or about my face.</w:t>
       </w:r>
     </w:p>
     <w:p>
@@ -11903,7 +11903,7 @@
         <w:rPr>
           <w:lang w:val="en-US"/>
         </w:rPr>
-        <w:t xml:space="preserve">I should say what that cost. It was not a matter of loneliness, though I was lonely. It was a matter of knowledge. A person who has found nineteen strangers whom he knows more about than they know about themselves is not an observer. He is something else. I felt it first as a kind of weight, then as a kind of vertigo, and in the end as a low steady shame, like the sound of a refrigerator in a quiet house. I knew that a girl of fifteen in a town in the north was going to be offered a place at a music school, and that she would have to choose between it and a different life, and that her choosing would turn on whether anyone told her what she was. I knew that a boy of twelve had stopped talking at school. I knew his mother’s name. I was not permitted, by my own rule, to call her up and say</w:t>
+        <w:t xml:space="preserve">It cost something. It was not a matter of loneliness, though I was lonely. It was a matter of knowledge. A person who has found nineteen strangers whom he knows more about than they know about themselves is not an observer. He is something else. I felt it first as a kind of weight, then as a kind of vertigo, and in the end as a low steady shame, like the sound of a refrigerator in a quiet house. I knew that a girl of fifteen in a town in the north was going to be offered a place at a music school, and that she would have to choose between it and a different life, and that her choosing would turn on whether anyone told her what she was. I knew that a boy of twelve had stopped talking at school. I knew his mother’s name. I was not permitted, by my own rule, to call her up and say</w:t>
       </w:r>
       <w:r>
         <w:rPr>
@@ -12129,18 +12129,18 @@
         <w:rPr>
           <w:lang w:val="en-US"/>
         </w:rPr>
-        <w:t xml:space="preserve">I looked at the date on the notebook in my bag. I did the arithmetic on my fingers, as a child does. A five-year-old in the autumn of 2018 had been born in the early months of 2013. She had been conceived, if she had been conceived through the clinic, in the spring of 2012.</w:t>
-      </w:r>
-    </w:p>
-    <w:p>
-      <w:pPr>
-        <w:pStyle w:val="BodyText"/>
-      </w:pPr>
-      <w:r>
-        <w:rPr>
-          <w:lang w:val="en-US"/>
-        </w:rPr>
-        <w:t xml:space="preserve">I thought of a Thursday in November of 2011, and a man sitting at his bench with three embryos in an incubator, and a couple who had waited seven years.</w:t>
+        <w:t xml:space="preserve">I looked at the date on the notebook in my bag. I did the arithmetic on my fingers, as a child does. A five-year-old in the autumn of 2018 had been born at the end of 2012. She had been conceived, if she had been conceived through the clinic, in the spring of 2012.</w:t>
+      </w:r>
+    </w:p>
+    <w:p>
+      <w:pPr>
+        <w:pStyle w:val="BodyText"/>
+      </w:pPr>
+      <w:r>
+        <w:rPr>
+          <w:lang w:val="en-US"/>
+        </w:rPr>
+        <w:t xml:space="preserve">I thought of a Tuesday in November of 2011, and a man sitting at his bench with three embryos in an incubator, and a couple who had waited seven years.</w:t>
       </w:r>
     </w:p>
     <w:p>
@@ -12308,7 +12308,7 @@
         <w:rPr>
           <w:lang w:val="en-US"/>
         </w:rPr>
-        <w:t xml:space="preserve">I had spent eight months working out what that meant. It had meant a good many hours in libraries, reading the acknowledgments sections of papers on speech perception, until one name appeared three times in a row. A student, a second-year, in a laboratory at a state university four hours from my parents’ flat.</w:t>
+        <w:t xml:space="preserve">I had spent eight months working out what that meant. It had meant a good many hours in libraries, reading the acknowledgments sections of papers on speech perception, until one name appeared three times in a row. A student, a second-year, in a laboratory at a state university four hours from my parents’ apartment.</w:t>
       </w:r>
     </w:p>
     <w:p>
@@ -12469,6 +12469,17 @@
         <w:rPr>
           <w:lang w:val="en-US"/>
         </w:rPr>
+        <w:t xml:space="preserve">I would like it noted that I did not approach her. I stood in a corridor and held my breath until I was found. It is a technicality, and I have lived on it ever since.</w:t>
+      </w:r>
+    </w:p>
+    <w:p>
+      <w:pPr>
+        <w:pStyle w:val="BodyText"/>
+      </w:pPr>
+      <w:r>
+        <w:rPr>
+          <w:lang w:val="en-US"/>
+        </w:rPr>
         <w:t xml:space="preserve">“You stopped breathing when I did the glottal one,”</w:t>
       </w:r>
       <w:r>
@@ -14504,7 +14515,7 @@
         <w:rPr>
           <w:lang w:val="en-US"/>
         </w:rPr>
-        <w:t xml:space="preserve">That is how I came to keep a secret from the person with the most reason to be told. I want to be honest about my motives. I did not suspect him of anything. I had no evidence, and I do not trust a suspicion with no evidence. It was simply that I had heard something I did not recognize, and I had learned, from Stone’s notebook, from a thousand hours in a hospital, and from my own life, that when I do not recognize a sound I should leave it alone until I do.</w:t>
+        <w:t xml:space="preserve">That is how I came to keep a secret from the person with the most reason to be told. I did not suspect him of anything. I had no evidence, and I do not trust a suspicion with no evidence. It was simply that I had heard something I did not recognize, and I had learned, from Stone’s notebook, from a thousand hours in a hospital, and from my own life, that when I do not recognize a sound I should leave it alone until I do.</w:t>
       </w:r>
     </w:p>
     <w:p>
@@ -14810,7 +14821,7 @@
         <w:rPr>
           <w:lang w:val="en-US"/>
         </w:rPr>
-        <w:t xml:space="preserve">I had my degree. I had a long black gown and a hood in the colors of my school, which my mother said was the nicest shade of green she had ever seen. My parents had driven four hours. My father wore his good jacket, and had cleaned his fingernails, and sat for two hours with his hands on his knees, looking at the stage with the stern happiness of someone carrying a piano up a flight of stairs. My mother cried from the first name to the last.</w:t>
+        <w:t xml:space="preserve">I had my medical degree. I had a long black gown and a hood in the colors of my school, which my mother said was the nicest shade of green she had ever seen. My parents had driven four hours. My father wore his good jacket, and had cleaned his fingernails, and sat for two hours with his hands on his knees, looking at the stage with the stern happiness of someone carrying a piano up a flight of stairs. My mother cried from the first name to the last.</w:t>
       </w:r>
     </w:p>
     <w:p>
@@ -15250,7 +15261,7 @@
         <w:rPr>
           <w:lang w:val="en-US"/>
         </w:rPr>
-        <w:t xml:space="preserve">We argued. I want to be clear that it was not a quarrel, though it was nearly one, and that it was the most important conversation I have ever been part of. We argued about what the gifted owe the rest.</w:t>
+        <w:t xml:space="preserve">We argued. It was not a quarrel, though it was nearly one, and it was the most important conversation I have ever been part of. We argued about what the gifted owe the rest.</w:t>
       </w:r>
     </w:p>
     <w:p>
@@ -15625,7 +15636,7 @@
         <w:rPr>
           <w:lang w:val="en-US"/>
         </w:rPr>
-        <w:t xml:space="preserve">I will say at once that I did not want them to go. I said the opposite. I said that it was a wonderful opportunity, and that Germany was a serious country, and that Mira’s German, which she had acquired in nineteen months of evening classes and a good deal of eavesdropping, was already better than mine. All of that was true. But I had found them, eight years earlier, in a basement, and they were the first of us that I had been able to tell the truth to, and I had a childish sense that if they went away I would have to start again.</w:t>
+        <w:t xml:space="preserve">I did not want them to go. I said the opposite. I said that it was a wonderful opportunity, and that Germany was a serious country, and that Mira’s German, which she had acquired in nineteen months of evening classes and a good deal of eavesdropping, was already better than mine. All of that was true. But I had found them, eight years earlier, in a basement, and they were the first of us that I had been able to tell the truth to, and I had a childish sense that if they went away I would have to start again.</w:t>
       </w:r>
     </w:p>
     <w:p>
@@ -15826,7 +15837,7 @@
         <w:rPr>
           <w:lang w:val="en-US"/>
         </w:rPr>
-        <w:t xml:space="preserve">The flat was on the third floor. It had high ceilings and a parquet floor, and the previous tenants had left behind a grandfather clock that neither of them knew what to do with. There was a long hallway, a kitchen with a yellow stove, two bedrooms, a room for work, and the balcony. I went out onto it and stood at the rail. Below me was a courtyard with a chestnut tree and a row of bicycles, and on the far side, at an angle, a pair of tall windows with lace curtains. Somewhere behind the curtains, very faintly, a clock was ticking.</w:t>
+        <w:t xml:space="preserve">The apartment was on the third floor. It had high ceilings and a parquet floor, and the previous tenants had left behind a grandfather clock that neither of them knew what to do with. There was a long hallway, a kitchen with a yellow stove, two bedrooms, a room for work, and the balcony. I went out onto it and stood at the rail. Below me was a courtyard with a chestnut tree and a row of bicycles, and on the far side, at an angle, a pair of tall windows with lace curtains. Somewhere behind the curtains, very faintly, a clock was ticking.</w:t>
       </w:r>
     </w:p>
     <w:p>
@@ -16548,7 +16559,7 @@
         <w:rPr>
           <w:lang w:val="en-US"/>
         </w:rPr>
-        <w:t xml:space="preserve">It was Elias’s. It was eleven pages, and three of them were equations. It had been submitted in March and refereed in a two weeks, by three reviewers who had each written, in the polite and slightly stunned language of their profession, that they could find nothing wrong with it. The world went mad for a week.</w:t>
+        <w:t xml:space="preserve">It was Elias’s. It was eleven pages, and three of them were equations. It had been submitted in March and refereed in two weeks, by three reviewers who had each written, in the polite and slightly stunned language of their profession, that they could find nothing wrong with it. The world went mad for a week.</w:t>
       </w:r>
     </w:p>
     <w:p>
@@ -16886,7 +16897,7 @@
         <w:rPr>
           <w:lang w:val="en-US"/>
         </w:rPr>
-        <w:t xml:space="preserve">Julian found out in 2028, and I will say how, since it is the one thing in this account that I cannot blame on anyone else.</w:t>
+        <w:t xml:space="preserve">Julian found out in 2028, and here is how, since it is the one thing in this account that I cannot blame on anyone else.</w:t>
       </w:r>
     </w:p>
     <w:p>
@@ -18151,7 +18162,7 @@
         <w:rPr>
           <w:lang w:val="en-US"/>
         </w:rPr>
-        <w:t xml:space="preserve">It happened without any election. The man who had held the seat for twenty-two years died in his sleep, in February, at the age of eighty-one, and the governor, who had been Julian’s patron for a decade, appointed him to fill the vacancy. He was thirty years old. He had turned thirty on the first of January. It was, as the newspapers all noted, the youngest age the Constitution allows.</w:t>
+        <w:t xml:space="preserve">It happened without any election. The man who had held the seat for twenty-two years died in his sleep, in February, at the age of eighty-one, and the governor, who had been Julian’s patron for a decade, appointed him to fill the vacancy. He was thirty years old. He had turned thirty that January. It was, as the newspapers all noted, the youngest age the Constitution allows.</w:t>
       </w:r>
     </w:p>
     <w:p>
@@ -18435,18 +18446,18 @@
         <w:rPr>
           <w:lang w:val="en-US"/>
         </w:rPr>
-        <w:t xml:space="preserve">Their daughter was born in December of 2027, in a hospital by the river, at eleven minutes past four in the afternoon.</w:t>
-      </w:r>
-    </w:p>
-    <w:p>
-      <w:pPr>
-        <w:pStyle w:val="BodyText"/>
-      </w:pPr>
-      <w:r>
-        <w:rPr>
-          <w:lang w:val="en-US"/>
-        </w:rPr>
-        <w:t xml:space="preserve">I was not there. I was on a night shift in a ward three thousand miles away, with a cold cup of coffee and a patient who would not stop humming. Mira called me at ten past eleven, my time, in a whisper, and said:</w:t>
+        <w:t xml:space="preserve">Their daughter was born in December of 2027, in a hospital by the river, at eleven minutes past four in the morning.</w:t>
+      </w:r>
+    </w:p>
+    <w:p>
+      <w:pPr>
+        <w:pStyle w:val="BodyText"/>
+      </w:pPr>
+      <w:r>
+        <w:rPr>
+          <w:lang w:val="en-US"/>
+        </w:rPr>
+        <w:t xml:space="preserve">I was not there. I was on a night shift in a ward an ocean away, with a cold cup of coffee and a patient who would not stop humming. Mira called me a little after five, my time, in a whisper, and said:</w:t>
       </w:r>
       <w:r>
         <w:rPr>
@@ -18700,7 +18711,7 @@
         <w:rPr>
           <w:lang w:val="en-US"/>
         </w:rPr>
-        <w:t xml:space="preserve">The flat was on the third floor, over a courtyard. The stairs were stone, and they carried every footfall to every wall. I stood on the second landing and listened. A radio, a floor above, playing something with a cello in it. A tap. A woman’s voice, lightly arguing, in Turkish. A clock.</w:t>
+        <w:t xml:space="preserve">The apartment was on the third floor, over a courtyard. The stairs were stone, and they carried every footfall to every wall. I stood on the second landing and listened. A radio, a floor above, playing something with a cello in it. A tap. A woman’s voice, lightly arguing, in Turkish. A clock.</w:t>
       </w:r>
     </w:p>
     <w:p>
@@ -19726,7 +19737,7 @@
         <w:rPr>
           <w:lang w:val="en-US"/>
         </w:rPr>
-        <w:t xml:space="preserve">He had been a senator for four months. I had seen him on the news, standing on the steps of a building in a good coat, saying that he would serve the people of his state with humility. I had heard the applause go on a half second too long. I had put the television off and gone for a walk.</w:t>
+        <w:t xml:space="preserve">He had been a senator for six months. I had seen him on the news, standing on the steps of a building in a good coat, saying that he would serve the people of his state with humility. I had heard the applause go on a half second too long. I had put the television off and gone for a walk.</w:t>
       </w:r>
     </w:p>
     <w:p>
@@ -20126,7 +20137,7 @@
         <w:rPr>
           <w:lang w:val="en-US"/>
         </w:rPr>
-        <w:t xml:space="preserve">I made a list. I always make a list.</w:t>
+        <w:t xml:space="preserve">I made a list. I always make a list. My mother says I came out of the womb with a clipboard, and that she would have noticed the shape.</w:t>
       </w:r>
     </w:p>
     <w:p>
@@ -21383,7 +21394,7 @@
         <w:rPr>
           <w:lang w:val="en-US"/>
         </w:rPr>
-        <w:t xml:space="preserve">I should say how little I knew about Julian by then, and how much I thought I knew.</w:t>
+        <w:t xml:space="preserve">I knew little about Julian by then, and thought I knew a great deal.</w:t>
       </w:r>
     </w:p>
     <w:p>
@@ -22004,7 +22015,7 @@
         <w:rPr>
           <w:lang w:val="en-US"/>
         </w:rPr>
-        <w:t xml:space="preserve">“Four years,”</w:t>
+        <w:t xml:space="preserve">“Five years,”</w:t>
       </w:r>
       <w:r>
         <w:rPr>
@@ -22247,7 +22258,7 @@
         <w:rPr>
           <w:lang w:val="en-US"/>
         </w:rPr>
-        <w:t xml:space="preserve">I will say that I learned a great deal about silence in that time, and that most of it was unwelcome. I learned that my ears, which could tell a lie from a pulse at forty feet, could not tell me what I was doing wrong. I learned that the quiet ones, who had always rung me on Sundays, called on other days, and spoke to one another first. I learned from the florist, in a long careful email with a photograph of tulips attached, that</w:t>
+        <w:t xml:space="preserve">I learned a great deal about silence in that time, and most of it was unwelcome. I learned that my ears, which could tell a lie from a pulse at forty feet, could not tell me what I was doing wrong. I learned that the quiet ones, who had always rung me on Sundays, called on other days, and spoke to one another first. I learned from the florist, in a long careful email with a photograph of tulips attached, that</w:t>
       </w:r>
       <w:r>
         <w:rPr>
@@ -22537,7 +22548,7 @@
         <w:rPr>
           <w:lang w:val="en-US"/>
         </w:rPr>
-        <w:t xml:space="preserve">I want to say that I took this in calmly, but I stood in the doorway of the old Central Valley lobby with a laminated visitor’s badge on a lanyard around my neck, and what I thought, with great clarity, was:</w:t>
+        <w:t xml:space="preserve">I did not take this in calmly. I stood in the doorway of the old Central Valley lobby with a laminated visitor’s badge on a lanyard around my neck, and what I thought, with great clarity, was:</w:t>
       </w:r>
       <w:r>
         <w:rPr>
@@ -25099,7 +25110,7 @@
         <w:rPr>
           <w:lang w:val="en-US"/>
         </w:rPr>
-        <w:t xml:space="preserve">I will say it was hard not to tell her.</w:t>
+        <w:t xml:space="preserve">It was hard not to tell her.</w:t>
       </w:r>
     </w:p>
     <w:p>
@@ -25128,7 +25139,7 @@
         <w:rPr>
           <w:lang w:val="en-US"/>
         </w:rPr>
-        <w:t xml:space="preserve">I will not describe the molecule. It is not mine to describe, and it is not interesting to anyone who has not spent years in a laboratory. I will say that it took us three years to find a version that did not kill the mice, another two to find one that did not kill the monkeys, and a long and very dull year of trials in people who had volunteered for a thing they could not have understood.</w:t>
+        <w:t xml:space="preserve">I will not describe the molecule. It is not mine to describe, and it is not interesting to anyone who has not spent years in a laboratory. It took us three years to find a version that did not kill the mice, another two to find one that did not kill the monkeys, and a long and very dull year of trials in people who had volunteered for a thing they could not have understood.</w:t>
       </w:r>
     </w:p>
     <w:p>
@@ -25253,18 +25264,18 @@
         <w:rPr>
           <w:lang w:val="en-US"/>
         </w:rPr>
-        <w:t xml:space="preserve">We ran the late-recovery trial in 2035. It was long and very dull, and nobody believed it until the third site reported. By the autumn of 2036 it was approved, in a small way and with a great many conditions, for strokes more than a year old.</w:t>
-      </w:r>
-    </w:p>
-    <w:p>
-      <w:pPr>
-        <w:pStyle w:val="BodyText"/>
-      </w:pPr>
-      <w:r>
-        <w:rPr>
-          <w:lang w:val="en-US"/>
-        </w:rPr>
-        <w:t xml:space="preserve">I do not want to make too much of this. It was a slow, modest, expensive result, arrived at by accident and mostly by other people. But I will say that on the day the third site reported, I went into the stairwell and stood against the wall with my hands over my face, and Dr. Voss, who had followed me out, said nothing at all for a full minute, and then said, quite gently:</w:t>
+        <w:t xml:space="preserve">We ran the late-recovery trial from the summer of 2034. It was long and very dull, and nobody believed it until the third site reported, in the winter of 2035. By the autumn of 2036 it was approved, in a small way and with a great many conditions, for strokes more than a year old.</w:t>
+      </w:r>
+    </w:p>
+    <w:p>
+      <w:pPr>
+        <w:pStyle w:val="BodyText"/>
+      </w:pPr>
+      <w:r>
+        <w:rPr>
+          <w:lang w:val="en-US"/>
+        </w:rPr>
+        <w:t xml:space="preserve">I do not want to make too much of this. It was a slow, modest, expensive result, arrived at by accident and mostly by other people. But on the day the third site reported, I went into the stairwell and stood against the wall with my hands over my face, and Dr. Voss, who had followed me out, said nothing at all for a full minute, and then said, quite gently:</w:t>
       </w:r>
       <w:r>
         <w:rPr>
@@ -25339,7 +25350,7 @@
         <w:rPr>
           <w:lang w:val="en-US"/>
         </w:rPr>
-        <w:t xml:space="preserve">Stone was eighty-three. He was in the chair by the window, which was the third window he had had, in the third home. The staff had changed several times since 2016, but the nurses all knew him as</w:t>
+        <w:t xml:space="preserve">Stone was eighty-four. He was in the chair by the window, which was the third window he had had, in the third home. The staff had changed several times since 2016, but the nurses all knew him as</w:t>
       </w:r>
       <w:r>
         <w:rPr>
@@ -25399,7 +25410,7 @@
         <w:rPr>
           <w:lang w:val="en-US"/>
         </w:rPr>
-        <w:t xml:space="preserve">He looked at me. I had grown used to this look, over seventeen years, and I could not have said what was in it. It might have been intelligence. It might have been the long patience of a creature that waits at a window.</w:t>
+        <w:t xml:space="preserve">He looked at me. I had grown used to this look, over nearly twenty years, and I could not have said what was in it. It might have been intelligence. It might have been the long patience of a creature that waits at a window.</w:t>
       </w:r>
     </w:p>
     <w:p>
@@ -25572,7 +25583,7 @@
         <w:rPr>
           <w:lang w:val="en-US"/>
         </w:rPr>
-        <w:t xml:space="preserve">I mean the cure. I mean the real one, the one still some years away, the one that would take a man who had not spoken in twenty years and give him back his voice. I mean what he would do with it.</w:t>
+        <w:t xml:space="preserve">I mean the cure. I mean the real one, the one still some years away, the one that would take a man who had not spoken in more than twenty years and give him back his voice. I mean what he would do with it.</w:t>
       </w:r>
     </w:p>
     <w:p>
@@ -25750,7 +25761,7 @@
         <w:rPr>
           <w:lang w:val="en-US"/>
         </w:rPr>
-        <w:t xml:space="preserve">But the index was gone. I knew that. I had seen him look at his own handwriting and fail to read it. He was eighty-three, and whatever the molecule gave him, it could not give him back a language that the stroke had taken. The danger I imagined, a rejuvenated Stone, striding out of a hospital with the plan in his head, was a danger I had invented. The man in the chair could not do arithmetic.</w:t>
+        <w:t xml:space="preserve">But the index was gone. I knew that. I had seen him look at his own handwriting and fail to read it. He was eighty-four, and whatever the molecule gave him, it could not give him back a language that the stroke had taken. The danger I imagined, a rejuvenated Stone, striding out of a hospital with the plan in his head, was a danger I had invented. The man in the chair could not do arithmetic.</w:t>
       </w:r>
     </w:p>
     <w:p>
@@ -25856,7 +25867,7 @@
         <w:rPr>
           <w:lang w:val="en-US"/>
         </w:rPr>
-        <w:t xml:space="preserve">It had taken me fifteen years to build. It was careful and kind and it had kept me, so far as I could tell, from doing a single useful thing for four of the people on my list. His was simpler. His was</w:t>
+        <w:t xml:space="preserve">It had taken me seventeen years to build. It was careful and kind and it had kept me, so far as I could tell, from doing a single useful thing for four of the people on my list. His was simpler. His was</w:t>
       </w:r>
       <w:r>
         <w:rPr>
@@ -25946,7 +25957,7 @@
         <w:rPr>
           <w:lang w:val="en-US"/>
         </w:rPr>
-        <w:t xml:space="preserve">He was twenty-eight now. I found him in a low brick building at the edge of a college town that had once been a hosiery factory and was now, according to the sign,</w:t>
+        <w:t xml:space="preserve">He was twenty-nine now. I found him in a low brick building at the edge of a college town that had once been a hosiery factory and was now, according to the sign,</w:t>
       </w:r>
       <w:r>
         <w:rPr>
@@ -25983,7 +25994,7 @@
         <w:rPr>
           <w:lang w:val="en-US"/>
         </w:rPr>
-        <w:t xml:space="preserve">It was a very good studio. I want to say that, because it would be much easier to tell you it was a prison. It was warm and quiet, with high windows and wooden floors and a smell of beeswax. It had been soundproofed by someone who knew what they were doing: the walls were thick and curved, the corners rounded, and the one clock on the wall had been fitted with a mechanism that did not tick. In the middle of the main room there were eleven people, aged from nine to fifty, sitting in a loose circle on cushions and doing absolutely nothing. A woman with a viola played one long note. They listened.</w:t>
+        <w:t xml:space="preserve">It was a very good studio. It would be much easier to tell you it was a prison. It was warm and quiet, with high windows and wooden floors and a smell of beeswax. It had been soundproofed by someone who knew what they were doing: the walls were thick and curved, the corners rounded, and the one clock on the wall had been fitted with a mechanism that did not tick. In the middle of the main room there were eleven people, aged from nine to fifty, sitting in a loose circle on cushions and doing absolutely nothing. A woman with a viola played one long note. They listened.</w:t>
       </w:r>
     </w:p>
     <w:p>
@@ -26480,7 +26491,7 @@
         <w:rPr>
           <w:lang w:val="en-US"/>
         </w:rPr>
-        <w:t xml:space="preserve">She was thirty-four. She lived in a room at a private clinic forty miles north, which belonged to a company that belonged to a trust, and the receptionist, who was very sweet, said that Ms. Imke saw visitors on Wednesdays between two and four.</w:t>
+        <w:t xml:space="preserve">She was thirty-five. She lived in a room at a private clinic forty miles north, which belonged to a company that belonged to a trust, and the receptionist, who was very sweet, said that Ms. Imke saw visitors on Wednesdays between two and four.</w:t>
       </w:r>
     </w:p>
     <w:p>
@@ -26795,7 +26806,7 @@
         <w:rPr>
           <w:lang w:val="en-US"/>
         </w:rPr>
-        <w:t xml:space="preserve">I want you to understand what I felt. It was not rage. It was something much more difficult, a sort of astonished, nauseated helplessness, like watching a man you have been told is a thief hand a coat to a stranger on a cold night.</w:t>
+        <w:t xml:space="preserve">It was not rage. It was something much more difficult, a sort of astonished, nauseated helplessness, like watching a man you have been told is a thief hand a coat to a stranger on a cold night.</w:t>
       </w:r>
     </w:p>
     <w:p>
@@ -27240,7 +27251,7 @@
         <w:rPr>
           <w:lang w:val="en-US"/>
         </w:rPr>
-        <w:t xml:space="preserve">I found her in a county I will not name, in a place that was less a field than a long, tilted piece of hillside with some goats on it. She had built a house the size of a garden shed out of old pallets, and she had a stove, and a rain barrel, and a view. She was thirty-four. She had been an excellent student, a record of straight A’s, until the day she walked out of an exam in the middle of a sentence and did not go back.</w:t>
+        <w:t xml:space="preserve">I found her in a county I will not name, in a place that was less a field than a long, tilted piece of hillside with some goats on it. She had built a house the size of a garden shed out of old pallets, and she had a stove, and a rain barrel, and a view. She was thirty-five. She had been an excellent student, a record of straight A’s, until the day she walked out of an exam in the middle of a sentence and did not go back.</w:t>
       </w:r>
     </w:p>
     <w:p>
@@ -27565,7 +27576,7 @@
         <w:rPr>
           <w:lang w:val="en-US"/>
         </w:rPr>
-        <w:t xml:space="preserve">I will say what I learned, since I promised to set down everything. It was this. I had spent fifteen years believing that the thing wrong with the four question marks was that they did not know. I had told myself that when I could find the right words, they would be saved by the telling. And I had found that two of them were happy, one was loyal, and one had chosen to live in a field, and that every one of them had been found by someone who did not tell them anything at all.</w:t>
+        <w:t xml:space="preserve">Here is what I learned. I had spent seventeen years believing that the thing wrong with the four question marks was that they did not know. I had told myself that when I could find the right words, they would be saved by the telling. And I had found that two of them were happy, one was loyal, and one had chosen to live in a field, and that every one of them had been found by someone who did not tell them anything at all.</w:t>
       </w:r>
     </w:p>
     <w:p>
@@ -27601,7 +27612,7 @@
         <w:rPr>
           <w:lang w:val="en-US"/>
         </w:rPr>
-        <w:t xml:space="preserve">I had thought of my rule as kindness. I saw now that it was control, in a gentler coat. I had wanted to be the one to decide when each of them was ready. It was Stone’s sin, in miniature, and I had worn it for fifteen years without noticing, because it fitted so well.</w:t>
+        <w:t xml:space="preserve">I had thought of my rule as kindness. I saw now that it was control, in a gentler coat. I had wanted to be the one to decide when each of them was ready. It was Stone’s sin, in miniature, and I had worn it for seventeen years without noticing, because it fitted so well.</w:t>
       </w:r>
     </w:p>
     <w:p>
@@ -27728,7 +27739,7 @@
         <w:rPr>
           <w:lang w:val="en-US"/>
         </w:rPr>
-        <w:t xml:space="preserve">, and that I had always assumed it would reappear. It reappeared three times. Each time it had been improved a little, as a tooth is improved by the dentist, and each time a different set of reviewers had found, with a different set of sighs, that the unannotated region was probably an artifact. In the spring of 2035, a fourth journal, one that did not ask hard questions, printed it. It ran to eleven pages. Its authors, three men and a woman who had by then lost most of their hair, thanked their funders and their families and, at the very bottom, in a sentence that no one read for months, a</w:t>
+        <w:t xml:space="preserve">, and that I had always assumed it would reappear. It reappeared three times. Each time it had been improved a little, as a tooth is improved by the dentist, and each time a different set of reviewers had found, with a different set of sighs, that the unannotated region was probably an artifact. In the autumn of 2035, a fourth journal, one that did not ask hard questions, printed it. It ran to eleven pages. Its authors, three men and a woman who had by then lost most of their hair, thanked their funders and their families and, at the very bottom, in a sentence that no one read for months, a</w:t>
       </w:r>
       <w:r>
         <w:rPr>
@@ -27810,7 +27821,7 @@
         <w:rPr>
           <w:lang w:val="en-US"/>
         </w:rPr>
-        <w:t xml:space="preserve">The editor-in-chief of the fourth journal, the one that did not ask hard questions, sat on the advisory board of the Leaf Foundation. So did the county’s new health commissioner, who had been appointed in January, and who had opened the basement ledgers in February</w:t>
+        <w:t xml:space="preserve">The editor-in-chief of the fourth journal, the one that did not ask hard questions, sat on the advisory board of the Leaf Foundation. So did the county’s new health commissioner, who had been appointed in July, and who had opened the basement ledgers in August</w:t>
       </w:r>
       <w:r>
         <w:rPr>
@@ -28310,7 +28321,7 @@
         <w:rPr>
           <w:lang w:val="en-US"/>
         </w:rPr>
-        <w:t xml:space="preserve">A company in the Midwest made a notice of it. A bank in the South announced that it would hire only people who had</w:t>
+        <w:t xml:space="preserve">A company in the Midwest made a show of it. A bank in the South announced that it would hire only people who had</w:t>
       </w:r>
       <w:r>
         <w:rPr>
@@ -29002,7 +29013,7 @@
         <w:rPr>
           <w:lang w:val="en-US"/>
         </w:rPr>
-        <w:t xml:space="preserve">I should say that I had prepared for this. I had rehearsed it in the car and in the shower and once, absurdly, in front of the bathroom mirror, as I used to rehearse telling my parents. I had a number of answers. They were all excellent. I opened my mouth to give one.</w:t>
+        <w:t xml:space="preserve">I had prepared for this. I had rehearsed it in the car and in the shower and once, absurdly, in front of the bathroom mirror, as I used to rehearse telling my parents. I had a number of answers. They were all excellent. I opened my mouth to give one.</w:t>
       </w:r>
     </w:p>
     <w:p>
@@ -29521,7 +29532,7 @@
         <w:rPr>
           <w:lang w:val="en-US"/>
         </w:rPr>
-        <w:t xml:space="preserve">and Stone had looked at a screen and seen, perhaps for the first time in four years, a figure he recognized.</w:t>
+        <w:t xml:space="preserve">and Stone had looked at a screen and seen, perhaps for the first time since the stroke, a figure he recognized.</w:t>
       </w:r>
     </w:p>
     <w:p>
@@ -30493,7 +30504,7 @@
         <w:rPr>
           <w:lang w:val="en-US"/>
         </w:rPr>
-        <w:t xml:space="preserve">Wren was twenty-three and had been born in the spring of 2013. I had first met her in the autumn of 2035, when she walked into the cafeteria of my hospital on a Tuesday and sat down across from me, with a tray of fries and the clear, steady look of a girl who had once waved at me from a sandpit.</w:t>
+        <w:t xml:space="preserve">Wren was twenty-three and had been born in December of 2012. I had first met her in December of 2035, when she walked into the cafeteria of my hospital on a Tuesday and sat down across from me, with a tray of fries and the clear, steady look of a girl who had once waved at me from a sandpit.</w:t>
       </w:r>
     </w:p>
     <w:p>
@@ -31801,7 +31812,7 @@
         <w:rPr>
           <w:lang w:val="en-US"/>
         </w:rPr>
-        <w:t xml:space="preserve">I could hear the whole building. In 4C, where the widow had died twenty years earlier, a young couple were making love, very quietly and with great concentration. In the stairwell, someone was carrying a bicycle.</w:t>
+        <w:t xml:space="preserve">I could hear the whole building. Through the ceiling, a young couple were making love, very quietly and with great concentration. In the stairwell, someone was carrying a bicycle.</w:t>
       </w:r>
     </w:p>
     <w:p>
@@ -32088,7 +32099,7 @@
         <w:rPr>
           <w:lang w:val="en-US"/>
         </w:rPr>
-        <w:t xml:space="preserve">I should say what Julian had become.</w:t>
+        <w:t xml:space="preserve">Here is what Julian had become.</w:t>
       </w:r>
     </w:p>
     <w:p>
@@ -32167,7 +32178,7 @@
         <w:rPr>
           <w:lang w:val="en-US"/>
         </w:rPr>
-        <w:t xml:space="preserve">I will not pretend I loved him. I will say that for twenty years I had listened to a man whose pulse was as steady as a clock, and had been unable to hear anything behind it. That is its own kind of knowledge. I had come to believe that he was the only person I had ever met who did not need to lie, because he had no gap between what he said and what he was. It was the most frightening thing I knew.</w:t>
+        <w:t xml:space="preserve">I will not pretend I loved him. For fourteen years I had listened to a man whose pulse was as steady as a clock, and had been unable to hear anything behind it. That is its own kind of knowledge. I had come to believe that he was the only person I had ever met who did not need to lie, because he had no gap between what he said and what he was. It was the most frightening thing I knew.</w:t>
       </w:r>
     </w:p>
     <w:p>
@@ -32474,7 +32485,7 @@
         <w:rPr>
           <w:lang w:val="en-US"/>
         </w:rPr>
-        <w:t xml:space="preserve">I have tried since to put them in order, and I cannot, because they came together, one on top of another, in a heap. The first was relief. It was physical. A muscle in my back, which I had not known was clenched, let go all at once, like a knot cut with a knife. The second was guilt, and it came a half-second later, not as an idea but as an ache, in the same place. I had spent twenty years refusing to say what I knew about that man, and now a stranger with a grievance and a legal rifle had done what I would not, and what I would have been ashamed to want.</w:t>
+        <w:t xml:space="preserve">I have tried since to put them in order, and I cannot, because they came together, one on top of another, in a heap. The first was relief. It was physical. A muscle in my back, which I had not known was clenched, let go all at once, like a knot cut with a knife. The second was guilt, and it came a half-second later, not as an idea but as an ache, in the same place. I had spent fourteen years refusing to say what I knew about that man, and now a stranger with a grievance and a legal rifle had done what I would not, and what I would have been ashamed to want.</w:t>
       </w:r>
     </w:p>
     <w:p>
@@ -34332,7 +34343,7 @@
         <w:rPr>
           <w:lang w:val="en-US"/>
         </w:rPr>
-        <w:t xml:space="preserve">He frowned, as though he had been handed the wrong form. Then something in his face gave way, and I saw the man who had stood in my mother’s examination room thirty-six years earlier and said, to the baby in the carrier,</w:t>
+        <w:t xml:space="preserve">He frowned, as though he had been handed the wrong form. Then something in his face gave way, and I saw the man who had stood in an examination room thirty-six years earlier and said, to the baby in the carrier,</w:t>
       </w:r>
       <w:r>
         <w:rPr>
@@ -34682,6 +34693,43 @@
         <w:rPr>
           <w:lang w:val="en-US"/>
         </w:rPr>
+        <w:t xml:space="preserve">The rest of us have gone on being what we were. Tobias sent a postcard of his bean plot with one word on the back. It was not</w:t>
+      </w:r>
+      <w:r>
+        <w:rPr>
+          <w:lang w:val="en-US"/>
+        </w:rPr>
+        <w:t xml:space="preserve"> </w:t>
+      </w:r>
+      <w:r>
+        <w:rPr>
+          <w:i/>
+          <w:iCs/>
+          <w:lang w:val="en-US"/>
+        </w:rPr>
+        <w:t xml:space="preserve">cabbage.</w:t>
+      </w:r>
+      <w:r>
+        <w:rPr>
+          <w:lang w:val="en-US"/>
+        </w:rPr>
+        <w:t xml:space="preserve"> </w:t>
+      </w:r>
+      <w:r>
+        <w:rPr>
+          <w:lang w:val="en-US"/>
+        </w:rPr>
+        <w:t xml:space="preserve">Maren, who has never owned a telephone, sent an egg by post. It arrived whole, which I take as a verdict on the postal service and not on me. Theo is at home, and his mother, I am told, has stopped writing him letters, because she has stopped needing to.</w:t>
+      </w:r>
+    </w:p>
+    <w:p>
+      <w:pPr>
+        <w:pStyle w:val="BodyText"/>
+      </w:pPr>
+      <w:r>
+        <w:rPr>
+          <w:lang w:val="en-US"/>
+        </w:rPr>
         <w:t xml:space="preserve">On the second to last day of treatment, I brought him a newspaper.</w:t>
       </w:r>
     </w:p>
@@ -35638,7 +35686,7 @@
         <w:rPr>
           <w:lang w:val="en-US"/>
         </w:rPr>
-        <w:t xml:space="preserve">1. How inheritance works</w:t>
+        <w:t xml:space="preserve">How inheritance works</w:t>
       </w:r>
     </w:p>
     <w:p>
@@ -36116,7 +36164,7 @@
         <w:rPr>
           <w:lang w:val="en-US"/>
         </w:rPr>
-        <w:t xml:space="preserve">2. Germline and body cells</w:t>
+        <w:t xml:space="preserve">Germline and body cells</w:t>
       </w:r>
     </w:p>
     <w:p>
@@ -36217,7 +36265,7 @@
         <w:rPr>
           <w:lang w:val="en-US"/>
         </w:rPr>
-        <w:t xml:space="preserve">3. Gene technology</w:t>
+        <w:t xml:space="preserve">Gene technology</w:t>
       </w:r>
     </w:p>
     <w:p>
@@ -36412,7 +36460,7 @@
         <w:rPr>
           <w:lang w:val="en-US"/>
         </w:rPr>
-        <w:t xml:space="preserve">4. Intelligence and the cognitive package</w:t>
+        <w:t xml:space="preserve">Intelligence and the cognitive package</w:t>
       </w:r>
     </w:p>
     <w:p>
@@ -36501,7 +36549,7 @@
         <w:rPr>
           <w:lang w:val="en-US"/>
         </w:rPr>
-        <w:t xml:space="preserve">5. The dolphin package</w:t>
+        <w:t xml:space="preserve">The dolphin package</w:t>
       </w:r>
     </w:p>
     <w:p>
@@ -36557,7 +36605,7 @@
         <w:rPr>
           <w:lang w:val="en-US"/>
         </w:rPr>
-        <w:t xml:space="preserve">6. Detection</w:t>
+        <w:t xml:space="preserve">Detection</w:t>
       </w:r>
     </w:p>
     <w:p>
@@ -36581,7 +36629,7 @@
         <w:rPr>
           <w:lang w:val="en-US"/>
         </w:rPr>
-        <w:t xml:space="preserve">7. What is fact and what is fiction</w:t>
+        <w:t xml:space="preserve">What is fact and what is fiction</w:t>
       </w:r>
     </w:p>
     <w:tbl>

</xml_diff>